<commit_message>
feat: implement Excel export functionality for RKBMD procurement and maintenance plans
</commit_message>
<xml_diff>
--- a/public/rkbmd/template-ba-desk.docx
+++ b/public/rkbmd/template-ba-desk.docx
@@ -4,7 +4,7 @@
   <w:body>
     <w:p>
       <w:pPr>
-        <w:spacing w:line="120" w:lineRule="auto"/>
+        <w:spacing w:line="276" w:lineRule="auto"/>
         <w:rPr>
           <w:rFonts w:ascii="Bookman Old Style" w:eastAsia="Bookman Old Style" w:hAnsi="Bookman Old Style" w:cs="Bookman Old Style"/>
           <w:sz w:val="24"/>
@@ -79,7 +79,7 @@
                           <pic:cNvPicPr preferRelativeResize="0"/>
                         </pic:nvPicPr>
                         <pic:blipFill>
-                          <a:blip r:embed="rId4"/>
+                          <a:blip r:embed="rId5"/>
                           <a:srcRect/>
                           <a:stretch>
                             <a:fillRect/>
@@ -171,6 +171,7 @@
               <w:tabs>
                 <w:tab w:val="left" w:pos="5812"/>
               </w:tabs>
+              <w:spacing w:line="276" w:lineRule="auto"/>
               <w:ind w:right="440"/>
               <w:jc w:val="center"/>
               <w:rPr>
@@ -178,12 +179,101 @@
                 <w:szCs w:val="24"/>
               </w:rPr>
             </w:pPr>
-            <w:r>
-              <w:rPr>
-                <w:sz w:val="24"/>
-                <w:szCs w:val="24"/>
-              </w:rPr>
-              <w:t>Komplek Perkantoran Raci, Jln Raya Raci KM 9 Raci-BANGIL</w:t>
+            <w:proofErr w:type="spellStart"/>
+            <w:r>
+              <w:rPr>
+                <w:sz w:val="24"/>
+                <w:szCs w:val="24"/>
+              </w:rPr>
+              <w:t>Komplek</w:t>
+            </w:r>
+            <w:proofErr w:type="spellEnd"/>
+            <w:r>
+              <w:rPr>
+                <w:sz w:val="24"/>
+                <w:szCs w:val="24"/>
+              </w:rPr>
+              <w:t xml:space="preserve"> </w:t>
+            </w:r>
+            <w:proofErr w:type="spellStart"/>
+            <w:r>
+              <w:rPr>
+                <w:sz w:val="24"/>
+                <w:szCs w:val="24"/>
+              </w:rPr>
+              <w:t>Perkantoran</w:t>
+            </w:r>
+            <w:proofErr w:type="spellEnd"/>
+            <w:r>
+              <w:rPr>
+                <w:sz w:val="24"/>
+                <w:szCs w:val="24"/>
+              </w:rPr>
+              <w:t xml:space="preserve"> </w:t>
+            </w:r>
+            <w:proofErr w:type="spellStart"/>
+            <w:r>
+              <w:rPr>
+                <w:sz w:val="24"/>
+                <w:szCs w:val="24"/>
+              </w:rPr>
+              <w:t>Raci</w:t>
+            </w:r>
+            <w:proofErr w:type="spellEnd"/>
+            <w:r>
+              <w:rPr>
+                <w:sz w:val="24"/>
+                <w:szCs w:val="24"/>
+              </w:rPr>
+              <w:t xml:space="preserve">, </w:t>
+            </w:r>
+            <w:proofErr w:type="spellStart"/>
+            <w:r>
+              <w:rPr>
+                <w:sz w:val="24"/>
+                <w:szCs w:val="24"/>
+              </w:rPr>
+              <w:t>Jln</w:t>
+            </w:r>
+            <w:proofErr w:type="spellEnd"/>
+            <w:r>
+              <w:rPr>
+                <w:sz w:val="24"/>
+                <w:szCs w:val="24"/>
+              </w:rPr>
+              <w:t xml:space="preserve"> Raya </w:t>
+            </w:r>
+            <w:proofErr w:type="spellStart"/>
+            <w:r>
+              <w:rPr>
+                <w:sz w:val="24"/>
+                <w:szCs w:val="24"/>
+              </w:rPr>
+              <w:t>Raci</w:t>
+            </w:r>
+            <w:proofErr w:type="spellEnd"/>
+            <w:r>
+              <w:rPr>
+                <w:sz w:val="24"/>
+                <w:szCs w:val="24"/>
+              </w:rPr>
+              <w:t xml:space="preserve"> KM 9 </w:t>
+            </w:r>
+            <w:proofErr w:type="spellStart"/>
+            <w:r>
+              <w:rPr>
+                <w:sz w:val="24"/>
+                <w:szCs w:val="24"/>
+              </w:rPr>
+              <w:t>Raci</w:t>
+            </w:r>
+            <w:proofErr w:type="spellEnd"/>
+            <w:r>
+              <w:rPr>
+                <w:sz w:val="24"/>
+                <w:szCs w:val="24"/>
+              </w:rPr>
+              <w:t>-BANGIL</w:t>
             </w:r>
           </w:p>
           <w:p>
@@ -192,6 +282,7 @@
               <w:tabs>
                 <w:tab w:val="left" w:pos="5812"/>
               </w:tabs>
+              <w:spacing w:line="276" w:lineRule="auto"/>
               <w:ind w:right="440"/>
               <w:jc w:val="center"/>
               <w:rPr>
@@ -213,6 +304,7 @@
               <w:tabs>
                 <w:tab w:val="left" w:pos="5812"/>
               </w:tabs>
+              <w:spacing w:line="276" w:lineRule="auto"/>
               <w:ind w:right="440"/>
               <w:jc w:val="center"/>
               <w:rPr>
@@ -223,12 +315,21 @@
             </w:pPr>
             <w:bookmarkStart w:id="0" w:name="_o14n677ni9th" w:colFirst="0" w:colLast="0"/>
             <w:bookmarkEnd w:id="0"/>
+            <w:proofErr w:type="gramStart"/>
             <w:r>
               <w:rPr>
                 <w:sz w:val="22"/>
                 <w:szCs w:val="22"/>
               </w:rPr>
-              <w:t>Email : bpkpd.kabpasuruan@gmail.com</w:t>
+              <w:t>Email :</w:t>
+            </w:r>
+            <w:proofErr w:type="gramEnd"/>
+            <w:r>
+              <w:rPr>
+                <w:sz w:val="22"/>
+                <w:szCs w:val="22"/>
+              </w:rPr>
+              <w:t xml:space="preserve"> bpkpd.kabpasuruan@gmail.com</w:t>
             </w:r>
           </w:p>
         </w:tc>
@@ -236,7 +337,7 @@
     </w:tbl>
     <w:p>
       <w:pPr>
-        <w:spacing w:line="360" w:lineRule="auto"/>
+        <w:spacing w:line="276" w:lineRule="auto"/>
         <w:jc w:val="center"/>
         <w:rPr>
           <w:rFonts w:ascii="Bookman Old Style" w:eastAsia="Bookman Old Style" w:hAnsi="Bookman Old Style" w:cs="Bookman Old Style"/>
@@ -256,7 +357,15 @@
           <w:sz w:val="24"/>
           <w:szCs w:val="24"/>
         </w:rPr>
-        <w:t>BERITA ACARA DESK PENGHAPUSAN BMD</w:t>
+        <w:t xml:space="preserve">BERITA ACARA </w:t>
+      </w:r>
+      <w:r>
+        <w:rPr>
+          <w:rFonts w:ascii="Bookman Old Style" w:eastAsia="Bookman Old Style" w:hAnsi="Bookman Old Style" w:cs="Bookman Old Style"/>
+          <w:sz w:val="24"/>
+          <w:szCs w:val="24"/>
+        </w:rPr>
+        <w:t>DESK USULAN RKBMD PENGAADAN 2027</w:t>
       </w:r>
       <w:r>
         <w:rPr>
@@ -301,17 +410,6 @@
         </w:rPr>
         <w:t>/2026</w:t>
       </w:r>
-    </w:p>
-    <w:p>
-      <w:pPr>
-        <w:spacing w:line="360" w:lineRule="auto"/>
-        <w:jc w:val="center"/>
-        <w:rPr>
-          <w:rFonts w:ascii="Bookman Old Style" w:eastAsia="Bookman Old Style" w:hAnsi="Bookman Old Style" w:cs="Bookman Old Style"/>
-          <w:sz w:val="24"/>
-          <w:szCs w:val="24"/>
-        </w:rPr>
-      </w:pPr>
     </w:p>
     <w:p>
       <w:pPr>
@@ -322,7 +420,7 @@
           <w:right w:val="nil"/>
           <w:between w:val="nil"/>
         </w:pBdr>
-        <w:spacing w:line="360" w:lineRule="auto"/>
+        <w:spacing w:line="276" w:lineRule="auto"/>
         <w:ind w:firstLine="851"/>
         <w:jc w:val="both"/>
         <w:rPr>
@@ -341,8 +439,39 @@
           <w:sz w:val="24"/>
           <w:szCs w:val="24"/>
         </w:rPr>
-        <w:t>Pada hari ini</w:t>
-      </w:r>
+        <w:t xml:space="preserve">Pada </w:t>
+      </w:r>
+      <w:proofErr w:type="spellStart"/>
+      <w:r>
+        <w:rPr>
+          <w:rFonts w:ascii="Bookman Old Style" w:eastAsia="Bookman Old Style" w:hAnsi="Bookman Old Style" w:cs="Bookman Old Style"/>
+          <w:color w:val="000000"/>
+          <w:sz w:val="24"/>
+          <w:szCs w:val="24"/>
+        </w:rPr>
+        <w:t>hari</w:t>
+      </w:r>
+      <w:proofErr w:type="spellEnd"/>
+      <w:r>
+        <w:rPr>
+          <w:rFonts w:ascii="Bookman Old Style" w:eastAsia="Bookman Old Style" w:hAnsi="Bookman Old Style" w:cs="Bookman Old Style"/>
+          <w:color w:val="000000"/>
+          <w:sz w:val="24"/>
+          <w:szCs w:val="24"/>
+        </w:rPr>
+        <w:t xml:space="preserve"> </w:t>
+      </w:r>
+      <w:proofErr w:type="spellStart"/>
+      <w:r>
+        <w:rPr>
+          <w:rFonts w:ascii="Bookman Old Style" w:eastAsia="Bookman Old Style" w:hAnsi="Bookman Old Style" w:cs="Bookman Old Style"/>
+          <w:color w:val="000000"/>
+          <w:sz w:val="24"/>
+          <w:szCs w:val="24"/>
+        </w:rPr>
+        <w:t>ini</w:t>
+      </w:r>
+      <w:proofErr w:type="spellEnd"/>
       <w:r>
         <w:rPr>
           <w:rFonts w:ascii="Bookman Old Style" w:eastAsia="Bookman Old Style" w:hAnsi="Bookman Old Style" w:cs="Bookman Old Style"/>
@@ -359,8 +488,9 @@
           <w:szCs w:val="24"/>
           <w:highlight w:val="yellow"/>
         </w:rPr>
-        <w:t>{hari}</w:t>
-      </w:r>
+        <w:t>{</w:t>
+      </w:r>
+      <w:proofErr w:type="spellStart"/>
       <w:r>
         <w:rPr>
           <w:rFonts w:ascii="Bookman Old Style" w:eastAsia="Bookman Old Style" w:hAnsi="Bookman Old Style" w:cs="Bookman Old Style"/>
@@ -368,8 +498,28 @@
           <w:szCs w:val="24"/>
           <w:highlight w:val="yellow"/>
         </w:rPr>
+        <w:t>hari</w:t>
+      </w:r>
+      <w:proofErr w:type="spellEnd"/>
+      <w:r>
+        <w:rPr>
+          <w:rFonts w:ascii="Bookman Old Style" w:eastAsia="Bookman Old Style" w:hAnsi="Bookman Old Style" w:cs="Bookman Old Style"/>
+          <w:sz w:val="24"/>
+          <w:szCs w:val="24"/>
+          <w:highlight w:val="yellow"/>
+        </w:rPr>
+        <w:t>}</w:t>
+      </w:r>
+      <w:r>
+        <w:rPr>
+          <w:rFonts w:ascii="Bookman Old Style" w:eastAsia="Bookman Old Style" w:hAnsi="Bookman Old Style" w:cs="Bookman Old Style"/>
+          <w:sz w:val="24"/>
+          <w:szCs w:val="24"/>
+          <w:highlight w:val="yellow"/>
+        </w:rPr>
         <w:t xml:space="preserve"> </w:t>
       </w:r>
+      <w:proofErr w:type="spellStart"/>
       <w:r>
         <w:rPr>
           <w:rFonts w:ascii="Bookman Old Style" w:eastAsia="Bookman Old Style" w:hAnsi="Bookman Old Style" w:cs="Bookman Old Style"/>
@@ -377,7 +527,17 @@
           <w:sz w:val="24"/>
           <w:szCs w:val="24"/>
         </w:rPr>
-        <w:t xml:space="preserve">tanggal </w:t>
+        <w:t>tanggal</w:t>
+      </w:r>
+      <w:proofErr w:type="spellEnd"/>
+      <w:r>
+        <w:rPr>
+          <w:rFonts w:ascii="Bookman Old Style" w:eastAsia="Bookman Old Style" w:hAnsi="Bookman Old Style" w:cs="Bookman Old Style"/>
+          <w:color w:val="000000"/>
+          <w:sz w:val="24"/>
+          <w:szCs w:val="24"/>
+        </w:rPr>
+        <w:t xml:space="preserve"> </w:t>
       </w:r>
       <w:r>
         <w:rPr>
@@ -386,8 +546,9 @@
           <w:szCs w:val="24"/>
           <w:highlight w:val="yellow"/>
         </w:rPr>
-        <w:t>{tanggal}</w:t>
-      </w:r>
+        <w:t>{</w:t>
+      </w:r>
+      <w:proofErr w:type="spellStart"/>
       <w:r>
         <w:rPr>
           <w:rFonts w:ascii="Bookman Old Style" w:eastAsia="Bookman Old Style" w:hAnsi="Bookman Old Style" w:cs="Bookman Old Style"/>
@@ -395,8 +556,28 @@
           <w:szCs w:val="24"/>
           <w:highlight w:val="yellow"/>
         </w:rPr>
+        <w:t>tanggal</w:t>
+      </w:r>
+      <w:proofErr w:type="spellEnd"/>
+      <w:r>
+        <w:rPr>
+          <w:rFonts w:ascii="Bookman Old Style" w:eastAsia="Bookman Old Style" w:hAnsi="Bookman Old Style" w:cs="Bookman Old Style"/>
+          <w:sz w:val="24"/>
+          <w:szCs w:val="24"/>
+          <w:highlight w:val="yellow"/>
+        </w:rPr>
+        <w:t>}</w:t>
+      </w:r>
+      <w:r>
+        <w:rPr>
+          <w:rFonts w:ascii="Bookman Old Style" w:eastAsia="Bookman Old Style" w:hAnsi="Bookman Old Style" w:cs="Bookman Old Style"/>
+          <w:sz w:val="24"/>
+          <w:szCs w:val="24"/>
+          <w:highlight w:val="yellow"/>
+        </w:rPr>
         <w:t xml:space="preserve"> </w:t>
       </w:r>
+      <w:proofErr w:type="spellStart"/>
       <w:r>
         <w:rPr>
           <w:rFonts w:ascii="Bookman Old Style" w:eastAsia="Bookman Old Style" w:hAnsi="Bookman Old Style" w:cs="Bookman Old Style"/>
@@ -404,7 +585,17 @@
           <w:sz w:val="24"/>
           <w:szCs w:val="24"/>
         </w:rPr>
-        <w:t xml:space="preserve">bulan </w:t>
+        <w:t>bulan</w:t>
+      </w:r>
+      <w:proofErr w:type="spellEnd"/>
+      <w:r>
+        <w:rPr>
+          <w:rFonts w:ascii="Bookman Old Style" w:eastAsia="Bookman Old Style" w:hAnsi="Bookman Old Style" w:cs="Bookman Old Style"/>
+          <w:color w:val="000000"/>
+          <w:sz w:val="24"/>
+          <w:szCs w:val="24"/>
+        </w:rPr>
+        <w:t xml:space="preserve"> </w:t>
       </w:r>
       <w:r>
         <w:rPr>
@@ -413,7 +604,27 @@
           <w:szCs w:val="24"/>
           <w:highlight w:val="yellow"/>
         </w:rPr>
-        <w:t>{bulan}</w:t>
+        <w:t>{</w:t>
+      </w:r>
+      <w:proofErr w:type="spellStart"/>
+      <w:r>
+        <w:rPr>
+          <w:rFonts w:ascii="Bookman Old Style" w:eastAsia="Bookman Old Style" w:hAnsi="Bookman Old Style" w:cs="Bookman Old Style"/>
+          <w:sz w:val="24"/>
+          <w:szCs w:val="24"/>
+          <w:highlight w:val="yellow"/>
+        </w:rPr>
+        <w:t>bulan</w:t>
+      </w:r>
+      <w:proofErr w:type="spellEnd"/>
+      <w:r>
+        <w:rPr>
+          <w:rFonts w:ascii="Bookman Old Style" w:eastAsia="Bookman Old Style" w:hAnsi="Bookman Old Style" w:cs="Bookman Old Style"/>
+          <w:sz w:val="24"/>
+          <w:szCs w:val="24"/>
+          <w:highlight w:val="yellow"/>
+        </w:rPr>
+        <w:t>}</w:t>
       </w:r>
       <w:r>
         <w:rPr>
@@ -425,6 +636,7 @@
         </w:rPr>
         <w:t xml:space="preserve"> </w:t>
       </w:r>
+      <w:proofErr w:type="spellStart"/>
       <w:r>
         <w:rPr>
           <w:rFonts w:ascii="Bookman Old Style" w:eastAsia="Bookman Old Style" w:hAnsi="Bookman Old Style" w:cs="Bookman Old Style"/>
@@ -432,7 +644,57 @@
           <w:sz w:val="24"/>
           <w:szCs w:val="24"/>
         </w:rPr>
-        <w:t xml:space="preserve">tahun Dua Ribu Dua Puluh </w:t>
+        <w:t>tahun</w:t>
+      </w:r>
+      <w:proofErr w:type="spellEnd"/>
+      <w:r>
+        <w:rPr>
+          <w:rFonts w:ascii="Bookman Old Style" w:eastAsia="Bookman Old Style" w:hAnsi="Bookman Old Style" w:cs="Bookman Old Style"/>
+          <w:color w:val="000000"/>
+          <w:sz w:val="24"/>
+          <w:szCs w:val="24"/>
+        </w:rPr>
+        <w:t xml:space="preserve"> Dua </w:t>
+      </w:r>
+      <w:proofErr w:type="spellStart"/>
+      <w:r>
+        <w:rPr>
+          <w:rFonts w:ascii="Bookman Old Style" w:eastAsia="Bookman Old Style" w:hAnsi="Bookman Old Style" w:cs="Bookman Old Style"/>
+          <w:color w:val="000000"/>
+          <w:sz w:val="24"/>
+          <w:szCs w:val="24"/>
+        </w:rPr>
+        <w:t>Ribu</w:t>
+      </w:r>
+      <w:proofErr w:type="spellEnd"/>
+      <w:r>
+        <w:rPr>
+          <w:rFonts w:ascii="Bookman Old Style" w:eastAsia="Bookman Old Style" w:hAnsi="Bookman Old Style" w:cs="Bookman Old Style"/>
+          <w:color w:val="000000"/>
+          <w:sz w:val="24"/>
+          <w:szCs w:val="24"/>
+        </w:rPr>
+        <w:t xml:space="preserve"> Dua </w:t>
+      </w:r>
+      <w:proofErr w:type="spellStart"/>
+      <w:r>
+        <w:rPr>
+          <w:rFonts w:ascii="Bookman Old Style" w:eastAsia="Bookman Old Style" w:hAnsi="Bookman Old Style" w:cs="Bookman Old Style"/>
+          <w:color w:val="000000"/>
+          <w:sz w:val="24"/>
+          <w:szCs w:val="24"/>
+        </w:rPr>
+        <w:t>Puluh</w:t>
+      </w:r>
+      <w:proofErr w:type="spellEnd"/>
+      <w:r>
+        <w:rPr>
+          <w:rFonts w:ascii="Bookman Old Style" w:eastAsia="Bookman Old Style" w:hAnsi="Bookman Old Style" w:cs="Bookman Old Style"/>
+          <w:color w:val="000000"/>
+          <w:sz w:val="24"/>
+          <w:szCs w:val="24"/>
+        </w:rPr>
+        <w:t xml:space="preserve"> </w:t>
       </w:r>
       <w:r>
         <w:rPr>
@@ -449,7 +711,87 @@
           <w:sz w:val="24"/>
           <w:szCs w:val="24"/>
         </w:rPr>
-        <w:t>, kami yang bertanda tangan di bawah ini:</w:t>
+        <w:t xml:space="preserve">, kami yang </w:t>
+      </w:r>
+      <w:proofErr w:type="spellStart"/>
+      <w:r>
+        <w:rPr>
+          <w:rFonts w:ascii="Bookman Old Style" w:eastAsia="Bookman Old Style" w:hAnsi="Bookman Old Style" w:cs="Bookman Old Style"/>
+          <w:color w:val="000000"/>
+          <w:sz w:val="24"/>
+          <w:szCs w:val="24"/>
+        </w:rPr>
+        <w:t>bertanda</w:t>
+      </w:r>
+      <w:proofErr w:type="spellEnd"/>
+      <w:r>
+        <w:rPr>
+          <w:rFonts w:ascii="Bookman Old Style" w:eastAsia="Bookman Old Style" w:hAnsi="Bookman Old Style" w:cs="Bookman Old Style"/>
+          <w:color w:val="000000"/>
+          <w:sz w:val="24"/>
+          <w:szCs w:val="24"/>
+        </w:rPr>
+        <w:t xml:space="preserve"> </w:t>
+      </w:r>
+      <w:proofErr w:type="spellStart"/>
+      <w:r>
+        <w:rPr>
+          <w:rFonts w:ascii="Bookman Old Style" w:eastAsia="Bookman Old Style" w:hAnsi="Bookman Old Style" w:cs="Bookman Old Style"/>
+          <w:color w:val="000000"/>
+          <w:sz w:val="24"/>
+          <w:szCs w:val="24"/>
+        </w:rPr>
+        <w:t>tangan</w:t>
+      </w:r>
+      <w:proofErr w:type="spellEnd"/>
+      <w:r>
+        <w:rPr>
+          <w:rFonts w:ascii="Bookman Old Style" w:eastAsia="Bookman Old Style" w:hAnsi="Bookman Old Style" w:cs="Bookman Old Style"/>
+          <w:color w:val="000000"/>
+          <w:sz w:val="24"/>
+          <w:szCs w:val="24"/>
+        </w:rPr>
+        <w:t xml:space="preserve"> di </w:t>
+      </w:r>
+      <w:proofErr w:type="spellStart"/>
+      <w:r>
+        <w:rPr>
+          <w:rFonts w:ascii="Bookman Old Style" w:eastAsia="Bookman Old Style" w:hAnsi="Bookman Old Style" w:cs="Bookman Old Style"/>
+          <w:color w:val="000000"/>
+          <w:sz w:val="24"/>
+          <w:szCs w:val="24"/>
+        </w:rPr>
+        <w:t>bawah</w:t>
+      </w:r>
+      <w:proofErr w:type="spellEnd"/>
+      <w:r>
+        <w:rPr>
+          <w:rFonts w:ascii="Bookman Old Style" w:eastAsia="Bookman Old Style" w:hAnsi="Bookman Old Style" w:cs="Bookman Old Style"/>
+          <w:color w:val="000000"/>
+          <w:sz w:val="24"/>
+          <w:szCs w:val="24"/>
+        </w:rPr>
+        <w:t xml:space="preserve"> </w:t>
+      </w:r>
+      <w:proofErr w:type="spellStart"/>
+      <w:r>
+        <w:rPr>
+          <w:rFonts w:ascii="Bookman Old Style" w:eastAsia="Bookman Old Style" w:hAnsi="Bookman Old Style" w:cs="Bookman Old Style"/>
+          <w:color w:val="000000"/>
+          <w:sz w:val="24"/>
+          <w:szCs w:val="24"/>
+        </w:rPr>
+        <w:t>ini</w:t>
+      </w:r>
+      <w:proofErr w:type="spellEnd"/>
+      <w:r>
+        <w:rPr>
+          <w:rFonts w:ascii="Bookman Old Style" w:eastAsia="Bookman Old Style" w:hAnsi="Bookman Old Style" w:cs="Bookman Old Style"/>
+          <w:color w:val="000000"/>
+          <w:sz w:val="24"/>
+          <w:szCs w:val="24"/>
+        </w:rPr>
+        <w:t>:</w:t>
       </w:r>
     </w:p>
     <w:tbl>
@@ -473,7 +815,7 @@
           </w:tcPr>
           <w:p>
             <w:pPr>
-              <w:spacing w:line="360" w:lineRule="auto"/>
+              <w:spacing w:line="276" w:lineRule="auto"/>
               <w:rPr>
                 <w:rFonts w:ascii="Bookman Old Style" w:eastAsia="Bookman Old Style" w:hAnsi="Bookman Old Style" w:cs="Bookman Old Style"/>
                 <w:sz w:val="24"/>
@@ -496,7 +838,7 @@
           </w:tcPr>
           <w:p>
             <w:pPr>
-              <w:spacing w:line="360" w:lineRule="auto"/>
+              <w:spacing w:line="276" w:lineRule="auto"/>
               <w:rPr>
                 <w:rFonts w:ascii="Bookman Old Style" w:eastAsia="Bookman Old Style" w:hAnsi="Bookman Old Style" w:cs="Bookman Old Style"/>
                 <w:sz w:val="24"/>
@@ -519,7 +861,7 @@
           </w:tcPr>
           <w:p>
             <w:pPr>
-              <w:spacing w:line="360" w:lineRule="auto"/>
+              <w:spacing w:line="276" w:lineRule="auto"/>
               <w:rPr>
                 <w:rFonts w:ascii="Bookman Old Style" w:eastAsia="Bookman Old Style" w:hAnsi="Bookman Old Style" w:cs="Bookman Old Style"/>
                 <w:sz w:val="24"/>
@@ -542,7 +884,7 @@
           </w:tcPr>
           <w:p>
             <w:pPr>
-              <w:spacing w:line="360" w:lineRule="auto"/>
+              <w:spacing w:line="276" w:lineRule="auto"/>
               <w:rPr>
                 <w:rFonts w:ascii="Bookman Old Style" w:eastAsia="Bookman Old Style" w:hAnsi="Bookman Old Style" w:cs="Bookman Old Style"/>
                 <w:sz w:val="24"/>
@@ -554,8 +896,29 @@
                 <w:rFonts w:ascii="Bookman Old Style" w:eastAsia="Bookman Old Style" w:hAnsi="Bookman Old Style" w:cs="Bookman Old Style"/>
                 <w:sz w:val="24"/>
                 <w:szCs w:val="24"/>
-              </w:rPr>
-              <w:t>{namaPerekon}</w:t>
+                <w:highlight w:val="yellow"/>
+              </w:rPr>
+              <w:t>{</w:t>
+            </w:r>
+            <w:proofErr w:type="spellStart"/>
+            <w:r>
+              <w:rPr>
+                <w:rFonts w:ascii="Bookman Old Style" w:eastAsia="Bookman Old Style" w:hAnsi="Bookman Old Style" w:cs="Bookman Old Style"/>
+                <w:sz w:val="24"/>
+                <w:szCs w:val="24"/>
+                <w:highlight w:val="yellow"/>
+              </w:rPr>
+              <w:t>namaPerekon</w:t>
+            </w:r>
+            <w:proofErr w:type="spellEnd"/>
+            <w:r>
+              <w:rPr>
+                <w:rFonts w:ascii="Bookman Old Style" w:eastAsia="Bookman Old Style" w:hAnsi="Bookman Old Style" w:cs="Bookman Old Style"/>
+                <w:sz w:val="24"/>
+                <w:szCs w:val="24"/>
+                <w:highlight w:val="yellow"/>
+              </w:rPr>
+              <w:t>}</w:t>
             </w:r>
           </w:p>
         </w:tc>
@@ -567,7 +930,7 @@
           </w:tcPr>
           <w:p>
             <w:pPr>
-              <w:spacing w:line="360" w:lineRule="auto"/>
+              <w:spacing w:line="276" w:lineRule="auto"/>
               <w:rPr>
                 <w:rFonts w:ascii="Bookman Old Style" w:eastAsia="Bookman Old Style" w:hAnsi="Bookman Old Style" w:cs="Bookman Old Style"/>
                 <w:sz w:val="24"/>
@@ -582,7 +945,7 @@
           </w:tcPr>
           <w:p>
             <w:pPr>
-              <w:spacing w:line="360" w:lineRule="auto"/>
+              <w:spacing w:line="276" w:lineRule="auto"/>
               <w:rPr>
                 <w:rFonts w:ascii="Bookman Old Style" w:eastAsia="Bookman Old Style" w:hAnsi="Bookman Old Style" w:cs="Bookman Old Style"/>
                 <w:sz w:val="24"/>
@@ -605,7 +968,7 @@
           </w:tcPr>
           <w:p>
             <w:pPr>
-              <w:spacing w:line="360" w:lineRule="auto"/>
+              <w:spacing w:line="276" w:lineRule="auto"/>
               <w:rPr>
                 <w:rFonts w:ascii="Bookman Old Style" w:eastAsia="Bookman Old Style" w:hAnsi="Bookman Old Style" w:cs="Bookman Old Style"/>
                 <w:sz w:val="24"/>
@@ -628,7 +991,7 @@
           </w:tcPr>
           <w:p>
             <w:pPr>
-              <w:spacing w:line="360" w:lineRule="auto"/>
+              <w:spacing w:line="276" w:lineRule="auto"/>
               <w:rPr>
                 <w:rFonts w:ascii="Bookman Old Style" w:eastAsia="Bookman Old Style" w:hAnsi="Bookman Old Style" w:cs="Bookman Old Style"/>
                 <w:sz w:val="24"/>
@@ -640,8 +1003,29 @@
                 <w:rFonts w:ascii="Bookman Old Style" w:eastAsia="Bookman Old Style" w:hAnsi="Bookman Old Style" w:cs="Bookman Old Style"/>
                 <w:sz w:val="24"/>
                 <w:szCs w:val="24"/>
-              </w:rPr>
-              <w:t>{nipPerekeon}</w:t>
+                <w:highlight w:val="yellow"/>
+              </w:rPr>
+              <w:t>{</w:t>
+            </w:r>
+            <w:proofErr w:type="spellStart"/>
+            <w:r>
+              <w:rPr>
+                <w:rFonts w:ascii="Bookman Old Style" w:eastAsia="Bookman Old Style" w:hAnsi="Bookman Old Style" w:cs="Bookman Old Style"/>
+                <w:sz w:val="24"/>
+                <w:szCs w:val="24"/>
+                <w:highlight w:val="yellow"/>
+              </w:rPr>
+              <w:t>nipPerekon</w:t>
+            </w:r>
+            <w:proofErr w:type="spellEnd"/>
+            <w:r>
+              <w:rPr>
+                <w:rFonts w:ascii="Bookman Old Style" w:eastAsia="Bookman Old Style" w:hAnsi="Bookman Old Style" w:cs="Bookman Old Style"/>
+                <w:sz w:val="24"/>
+                <w:szCs w:val="24"/>
+                <w:highlight w:val="yellow"/>
+              </w:rPr>
+              <w:t>}</w:t>
             </w:r>
           </w:p>
         </w:tc>
@@ -656,7 +1040,7 @@
           </w:tcPr>
           <w:p>
             <w:pPr>
-              <w:spacing w:line="360" w:lineRule="auto"/>
+              <w:spacing w:line="276" w:lineRule="auto"/>
               <w:rPr>
                 <w:rFonts w:ascii="Bookman Old Style" w:eastAsia="Bookman Old Style" w:hAnsi="Bookman Old Style" w:cs="Bookman Old Style"/>
                 <w:sz w:val="24"/>
@@ -671,13 +1055,14 @@
           </w:tcPr>
           <w:p>
             <w:pPr>
-              <w:spacing w:line="360" w:lineRule="auto"/>
+              <w:spacing w:line="276" w:lineRule="auto"/>
               <w:rPr>
                 <w:rFonts w:ascii="Bookman Old Style" w:eastAsia="Bookman Old Style" w:hAnsi="Bookman Old Style" w:cs="Bookman Old Style"/>
                 <w:sz w:val="24"/>
                 <w:szCs w:val="24"/>
               </w:rPr>
             </w:pPr>
+            <w:proofErr w:type="spellStart"/>
             <w:r>
               <w:rPr>
                 <w:rFonts w:ascii="Bookman Old Style" w:eastAsia="Bookman Old Style" w:hAnsi="Bookman Old Style" w:cs="Bookman Old Style"/>
@@ -686,6 +1071,7 @@
               </w:rPr>
               <w:t>Jabatan</w:t>
             </w:r>
+            <w:proofErr w:type="spellEnd"/>
           </w:p>
         </w:tc>
         <w:tc>
@@ -694,7 +1080,7 @@
           </w:tcPr>
           <w:p>
             <w:pPr>
-              <w:spacing w:line="360" w:lineRule="auto"/>
+              <w:spacing w:line="276" w:lineRule="auto"/>
               <w:rPr>
                 <w:rFonts w:ascii="Bookman Old Style" w:eastAsia="Bookman Old Style" w:hAnsi="Bookman Old Style" w:cs="Bookman Old Style"/>
                 <w:sz w:val="24"/>
@@ -717,7 +1103,7 @@
           </w:tcPr>
           <w:p>
             <w:pPr>
-              <w:spacing w:after="60" w:line="360" w:lineRule="auto"/>
+              <w:spacing w:after="60" w:line="276" w:lineRule="auto"/>
               <w:jc w:val="both"/>
               <w:rPr>
                 <w:rFonts w:ascii="Bookman Old Style" w:eastAsia="Bookman Old Style" w:hAnsi="Bookman Old Style" w:cs="Bookman Old Style"/>
@@ -727,13 +1113,149 @@
                 <w:szCs w:val="24"/>
               </w:rPr>
             </w:pPr>
-            <w:r>
-              <w:rPr>
-                <w:rFonts w:ascii="Bookman Old Style" w:eastAsia="Bookman Old Style" w:hAnsi="Bookman Old Style" w:cs="Bookman Old Style"/>
-                <w:sz w:val="24"/>
-                <w:szCs w:val="24"/>
-              </w:rPr>
-              <w:t xml:space="preserve">Staf Bidang Pengelolaan Barang Milik Daerah pada BKAD Kabupaten Pasuruan selanjutnya disebut sebagai </w:t>
+            <w:proofErr w:type="spellStart"/>
+            <w:r>
+              <w:rPr>
+                <w:rFonts w:ascii="Bookman Old Style" w:eastAsia="Bookman Old Style" w:hAnsi="Bookman Old Style" w:cs="Bookman Old Style"/>
+                <w:sz w:val="24"/>
+                <w:szCs w:val="24"/>
+              </w:rPr>
+              <w:t>Staf</w:t>
+            </w:r>
+            <w:proofErr w:type="spellEnd"/>
+            <w:r>
+              <w:rPr>
+                <w:rFonts w:ascii="Bookman Old Style" w:eastAsia="Bookman Old Style" w:hAnsi="Bookman Old Style" w:cs="Bookman Old Style"/>
+                <w:sz w:val="24"/>
+                <w:szCs w:val="24"/>
+              </w:rPr>
+              <w:t xml:space="preserve"> </w:t>
+            </w:r>
+            <w:proofErr w:type="spellStart"/>
+            <w:r>
+              <w:rPr>
+                <w:rFonts w:ascii="Bookman Old Style" w:eastAsia="Bookman Old Style" w:hAnsi="Bookman Old Style" w:cs="Bookman Old Style"/>
+                <w:sz w:val="24"/>
+                <w:szCs w:val="24"/>
+              </w:rPr>
+              <w:t>Bidang</w:t>
+            </w:r>
+            <w:proofErr w:type="spellEnd"/>
+            <w:r>
+              <w:rPr>
+                <w:rFonts w:ascii="Bookman Old Style" w:eastAsia="Bookman Old Style" w:hAnsi="Bookman Old Style" w:cs="Bookman Old Style"/>
+                <w:sz w:val="24"/>
+                <w:szCs w:val="24"/>
+              </w:rPr>
+              <w:t xml:space="preserve"> </w:t>
+            </w:r>
+            <w:proofErr w:type="spellStart"/>
+            <w:r>
+              <w:rPr>
+                <w:rFonts w:ascii="Bookman Old Style" w:eastAsia="Bookman Old Style" w:hAnsi="Bookman Old Style" w:cs="Bookman Old Style"/>
+                <w:sz w:val="24"/>
+                <w:szCs w:val="24"/>
+              </w:rPr>
+              <w:t>Pengelolaan</w:t>
+            </w:r>
+            <w:proofErr w:type="spellEnd"/>
+            <w:r>
+              <w:rPr>
+                <w:rFonts w:ascii="Bookman Old Style" w:eastAsia="Bookman Old Style" w:hAnsi="Bookman Old Style" w:cs="Bookman Old Style"/>
+                <w:sz w:val="24"/>
+                <w:szCs w:val="24"/>
+              </w:rPr>
+              <w:t xml:space="preserve"> Barang Milik Daerah pada BKAD </w:t>
+            </w:r>
+            <w:proofErr w:type="spellStart"/>
+            <w:r>
+              <w:rPr>
+                <w:rFonts w:ascii="Bookman Old Style" w:eastAsia="Bookman Old Style" w:hAnsi="Bookman Old Style" w:cs="Bookman Old Style"/>
+                <w:sz w:val="24"/>
+                <w:szCs w:val="24"/>
+              </w:rPr>
+              <w:t>Kabupaten</w:t>
+            </w:r>
+            <w:proofErr w:type="spellEnd"/>
+            <w:r>
+              <w:rPr>
+                <w:rFonts w:ascii="Bookman Old Style" w:eastAsia="Bookman Old Style" w:hAnsi="Bookman Old Style" w:cs="Bookman Old Style"/>
+                <w:sz w:val="24"/>
+                <w:szCs w:val="24"/>
+              </w:rPr>
+              <w:t xml:space="preserve"> </w:t>
+            </w:r>
+            <w:proofErr w:type="spellStart"/>
+            <w:r>
+              <w:rPr>
+                <w:rFonts w:ascii="Bookman Old Style" w:eastAsia="Bookman Old Style" w:hAnsi="Bookman Old Style" w:cs="Bookman Old Style"/>
+                <w:sz w:val="24"/>
+                <w:szCs w:val="24"/>
+              </w:rPr>
+              <w:t>Pasuruan</w:t>
+            </w:r>
+            <w:proofErr w:type="spellEnd"/>
+            <w:r>
+              <w:rPr>
+                <w:rFonts w:ascii="Bookman Old Style" w:eastAsia="Bookman Old Style" w:hAnsi="Bookman Old Style" w:cs="Bookman Old Style"/>
+                <w:sz w:val="24"/>
+                <w:szCs w:val="24"/>
+              </w:rPr>
+              <w:t xml:space="preserve"> </w:t>
+            </w:r>
+            <w:proofErr w:type="spellStart"/>
+            <w:r>
+              <w:rPr>
+                <w:rFonts w:ascii="Bookman Old Style" w:eastAsia="Bookman Old Style" w:hAnsi="Bookman Old Style" w:cs="Bookman Old Style"/>
+                <w:sz w:val="24"/>
+                <w:szCs w:val="24"/>
+              </w:rPr>
+              <w:t>selanjutnya</w:t>
+            </w:r>
+            <w:proofErr w:type="spellEnd"/>
+            <w:r>
+              <w:rPr>
+                <w:rFonts w:ascii="Bookman Old Style" w:eastAsia="Bookman Old Style" w:hAnsi="Bookman Old Style" w:cs="Bookman Old Style"/>
+                <w:sz w:val="24"/>
+                <w:szCs w:val="24"/>
+              </w:rPr>
+              <w:t xml:space="preserve"> </w:t>
+            </w:r>
+            <w:proofErr w:type="spellStart"/>
+            <w:r>
+              <w:rPr>
+                <w:rFonts w:ascii="Bookman Old Style" w:eastAsia="Bookman Old Style" w:hAnsi="Bookman Old Style" w:cs="Bookman Old Style"/>
+                <w:sz w:val="24"/>
+                <w:szCs w:val="24"/>
+              </w:rPr>
+              <w:t>disebut</w:t>
+            </w:r>
+            <w:proofErr w:type="spellEnd"/>
+            <w:r>
+              <w:rPr>
+                <w:rFonts w:ascii="Bookman Old Style" w:eastAsia="Bookman Old Style" w:hAnsi="Bookman Old Style" w:cs="Bookman Old Style"/>
+                <w:sz w:val="24"/>
+                <w:szCs w:val="24"/>
+              </w:rPr>
+              <w:t xml:space="preserve"> </w:t>
+            </w:r>
+            <w:proofErr w:type="spellStart"/>
+            <w:r>
+              <w:rPr>
+                <w:rFonts w:ascii="Bookman Old Style" w:eastAsia="Bookman Old Style" w:hAnsi="Bookman Old Style" w:cs="Bookman Old Style"/>
+                <w:sz w:val="24"/>
+                <w:szCs w:val="24"/>
+              </w:rPr>
+              <w:t>sebagai</w:t>
+            </w:r>
+            <w:proofErr w:type="spellEnd"/>
+            <w:r>
+              <w:rPr>
+                <w:rFonts w:ascii="Bookman Old Style" w:eastAsia="Bookman Old Style" w:hAnsi="Bookman Old Style" w:cs="Bookman Old Style"/>
+                <w:sz w:val="24"/>
+                <w:szCs w:val="24"/>
+              </w:rPr>
+              <w:t xml:space="preserve"> </w:t>
             </w:r>
             <w:r>
               <w:rPr>
@@ -755,7 +1277,7 @@
           </w:tcPr>
           <w:p>
             <w:pPr>
-              <w:spacing w:line="360" w:lineRule="auto"/>
+              <w:spacing w:line="276" w:lineRule="auto"/>
               <w:rPr>
                 <w:rFonts w:ascii="Bookman Old Style" w:eastAsia="Bookman Old Style" w:hAnsi="Bookman Old Style" w:cs="Bookman Old Style"/>
                 <w:sz w:val="24"/>
@@ -778,7 +1300,7 @@
           </w:tcPr>
           <w:p>
             <w:pPr>
-              <w:spacing w:line="360" w:lineRule="auto"/>
+              <w:spacing w:line="276" w:lineRule="auto"/>
               <w:rPr>
                 <w:rFonts w:ascii="Bookman Old Style" w:eastAsia="Bookman Old Style" w:hAnsi="Bookman Old Style" w:cs="Bookman Old Style"/>
                 <w:sz w:val="24"/>
@@ -801,7 +1323,7 @@
           </w:tcPr>
           <w:p>
             <w:pPr>
-              <w:spacing w:line="360" w:lineRule="auto"/>
+              <w:spacing w:line="276" w:lineRule="auto"/>
               <w:rPr>
                 <w:rFonts w:ascii="Bookman Old Style" w:eastAsia="Bookman Old Style" w:hAnsi="Bookman Old Style" w:cs="Bookman Old Style"/>
                 <w:sz w:val="24"/>
@@ -824,7 +1346,7 @@
           </w:tcPr>
           <w:p>
             <w:pPr>
-              <w:spacing w:line="360" w:lineRule="auto"/>
+              <w:spacing w:line="276" w:lineRule="auto"/>
               <w:rPr>
                 <w:rFonts w:ascii="Bookman Old Style" w:eastAsia="Bookman Old Style" w:hAnsi="Bookman Old Style" w:cs="Bookman Old Style"/>
                 <w:sz w:val="24"/>
@@ -839,8 +1361,9 @@
                 <w:szCs w:val="24"/>
                 <w:highlight w:val="yellow"/>
               </w:rPr>
-              <w:t>{nama</w:t>
-            </w:r>
+              <w:t>{</w:t>
+            </w:r>
+            <w:proofErr w:type="spellStart"/>
             <w:r>
               <w:rPr>
                 <w:rFonts w:ascii="Bookman Old Style" w:eastAsia="Bookman Old Style" w:hAnsi="Bookman Old Style" w:cs="Bookman Old Style"/>
@@ -848,6 +1371,15 @@
                 <w:szCs w:val="24"/>
                 <w:highlight w:val="yellow"/>
               </w:rPr>
+              <w:t>nama</w:t>
+            </w:r>
+            <w:r>
+              <w:rPr>
+                <w:rFonts w:ascii="Bookman Old Style" w:eastAsia="Bookman Old Style" w:hAnsi="Bookman Old Style" w:cs="Bookman Old Style"/>
+                <w:sz w:val="24"/>
+                <w:szCs w:val="24"/>
+                <w:highlight w:val="yellow"/>
+              </w:rPr>
               <w:t>P</w:t>
             </w:r>
             <w:r>
@@ -857,7 +1389,17 @@
                 <w:szCs w:val="24"/>
                 <w:highlight w:val="yellow"/>
               </w:rPr>
-              <w:t>eserta}</w:t>
+              <w:t>eserta</w:t>
+            </w:r>
+            <w:proofErr w:type="spellEnd"/>
+            <w:r>
+              <w:rPr>
+                <w:rFonts w:ascii="Bookman Old Style" w:eastAsia="Bookman Old Style" w:hAnsi="Bookman Old Style" w:cs="Bookman Old Style"/>
+                <w:sz w:val="24"/>
+                <w:szCs w:val="24"/>
+                <w:highlight w:val="yellow"/>
+              </w:rPr>
+              <w:t>}</w:t>
             </w:r>
           </w:p>
         </w:tc>
@@ -869,7 +1411,7 @@
           </w:tcPr>
           <w:p>
             <w:pPr>
-              <w:spacing w:line="360" w:lineRule="auto"/>
+              <w:spacing w:line="276" w:lineRule="auto"/>
               <w:rPr>
                 <w:rFonts w:ascii="Bookman Old Style" w:eastAsia="Bookman Old Style" w:hAnsi="Bookman Old Style" w:cs="Bookman Old Style"/>
                 <w:sz w:val="24"/>
@@ -884,7 +1426,7 @@
           </w:tcPr>
           <w:p>
             <w:pPr>
-              <w:spacing w:line="360" w:lineRule="auto"/>
+              <w:spacing w:line="276" w:lineRule="auto"/>
               <w:rPr>
                 <w:rFonts w:ascii="Bookman Old Style" w:eastAsia="Bookman Old Style" w:hAnsi="Bookman Old Style" w:cs="Bookman Old Style"/>
                 <w:sz w:val="24"/>
@@ -907,7 +1449,7 @@
           </w:tcPr>
           <w:p>
             <w:pPr>
-              <w:spacing w:line="360" w:lineRule="auto"/>
+              <w:spacing w:line="276" w:lineRule="auto"/>
               <w:rPr>
                 <w:rFonts w:ascii="Bookman Old Style" w:eastAsia="Bookman Old Style" w:hAnsi="Bookman Old Style" w:cs="Bookman Old Style"/>
                 <w:sz w:val="24"/>
@@ -930,7 +1472,7 @@
           </w:tcPr>
           <w:p>
             <w:pPr>
-              <w:spacing w:line="360" w:lineRule="auto"/>
+              <w:spacing w:line="276" w:lineRule="auto"/>
               <w:rPr>
                 <w:rFonts w:ascii="Bookman Old Style" w:eastAsia="Bookman Old Style" w:hAnsi="Bookman Old Style" w:cs="Bookman Old Style"/>
                 <w:sz w:val="24"/>
@@ -945,8 +1487,9 @@
                 <w:szCs w:val="24"/>
                 <w:highlight w:val="yellow"/>
               </w:rPr>
-              <w:t>{nip</w:t>
-            </w:r>
+              <w:t>{</w:t>
+            </w:r>
+            <w:proofErr w:type="spellStart"/>
             <w:r>
               <w:rPr>
                 <w:rFonts w:ascii="Bookman Old Style" w:eastAsia="Bookman Old Style" w:hAnsi="Bookman Old Style" w:cs="Bookman Old Style"/>
@@ -954,6 +1497,15 @@
                 <w:szCs w:val="24"/>
                 <w:highlight w:val="yellow"/>
               </w:rPr>
+              <w:t>nip</w:t>
+            </w:r>
+            <w:r>
+              <w:rPr>
+                <w:rFonts w:ascii="Bookman Old Style" w:eastAsia="Bookman Old Style" w:hAnsi="Bookman Old Style" w:cs="Bookman Old Style"/>
+                <w:sz w:val="24"/>
+                <w:szCs w:val="24"/>
+                <w:highlight w:val="yellow"/>
+              </w:rPr>
               <w:t>P</w:t>
             </w:r>
             <w:r>
@@ -963,7 +1515,17 @@
                 <w:szCs w:val="24"/>
                 <w:highlight w:val="yellow"/>
               </w:rPr>
-              <w:t>eserta}</w:t>
+              <w:t>eserta</w:t>
+            </w:r>
+            <w:proofErr w:type="spellEnd"/>
+            <w:r>
+              <w:rPr>
+                <w:rFonts w:ascii="Bookman Old Style" w:eastAsia="Bookman Old Style" w:hAnsi="Bookman Old Style" w:cs="Bookman Old Style"/>
+                <w:sz w:val="24"/>
+                <w:szCs w:val="24"/>
+                <w:highlight w:val="yellow"/>
+              </w:rPr>
+              <w:t>}</w:t>
             </w:r>
           </w:p>
         </w:tc>
@@ -975,7 +1537,7 @@
           </w:tcPr>
           <w:p>
             <w:pPr>
-              <w:spacing w:line="360" w:lineRule="auto"/>
+              <w:spacing w:line="276" w:lineRule="auto"/>
               <w:rPr>
                 <w:rFonts w:ascii="Bookman Old Style" w:eastAsia="Bookman Old Style" w:hAnsi="Bookman Old Style" w:cs="Bookman Old Style"/>
                 <w:sz w:val="24"/>
@@ -990,13 +1552,14 @@
           </w:tcPr>
           <w:p>
             <w:pPr>
-              <w:spacing w:line="360" w:lineRule="auto"/>
+              <w:spacing w:line="276" w:lineRule="auto"/>
               <w:rPr>
                 <w:rFonts w:ascii="Bookman Old Style" w:eastAsia="Bookman Old Style" w:hAnsi="Bookman Old Style" w:cs="Bookman Old Style"/>
                 <w:sz w:val="24"/>
                 <w:szCs w:val="24"/>
               </w:rPr>
             </w:pPr>
+            <w:proofErr w:type="spellStart"/>
             <w:r>
               <w:rPr>
                 <w:rFonts w:ascii="Bookman Old Style" w:eastAsia="Bookman Old Style" w:hAnsi="Bookman Old Style" w:cs="Bookman Old Style"/>
@@ -1005,6 +1568,7 @@
               </w:rPr>
               <w:t>Jabatan</w:t>
             </w:r>
+            <w:proofErr w:type="spellEnd"/>
           </w:p>
         </w:tc>
         <w:tc>
@@ -1013,7 +1577,7 @@
           </w:tcPr>
           <w:p>
             <w:pPr>
-              <w:spacing w:line="360" w:lineRule="auto"/>
+              <w:spacing w:line="276" w:lineRule="auto"/>
               <w:rPr>
                 <w:rFonts w:ascii="Bookman Old Style" w:eastAsia="Bookman Old Style" w:hAnsi="Bookman Old Style" w:cs="Bookman Old Style"/>
                 <w:sz w:val="24"/>
@@ -1036,7 +1600,7 @@
           </w:tcPr>
           <w:p>
             <w:pPr>
-              <w:spacing w:after="60" w:line="360" w:lineRule="auto"/>
+              <w:spacing w:after="60" w:line="276" w:lineRule="auto"/>
               <w:jc w:val="both"/>
               <w:rPr>
                 <w:rFonts w:ascii="Bookman Old Style" w:eastAsia="Bookman Old Style" w:hAnsi="Bookman Old Style" w:cs="Bookman Old Style"/>
@@ -1051,33 +1615,122 @@
                 <w:rFonts w:ascii="Bookman Old Style" w:eastAsia="Bookman Old Style" w:hAnsi="Bookman Old Style" w:cs="Bookman Old Style"/>
                 <w:sz w:val="24"/>
                 <w:szCs w:val="24"/>
-                <w:highlight w:val="yellow"/>
-              </w:rPr>
-              <w:t>&lt;&lt;jabatan&gt;&gt;</w:t>
-            </w:r>
-            <w:r>
-              <w:rPr>
-                <w:rFonts w:ascii="Bookman Old Style" w:eastAsia="Bookman Old Style" w:hAnsi="Bookman Old Style" w:cs="Bookman Old Style"/>
-                <w:sz w:val="24"/>
-                <w:szCs w:val="24"/>
-              </w:rPr>
-              <w:t xml:space="preserve"> pada </w:t>
-            </w:r>
-            <w:r>
-              <w:rPr>
-                <w:rFonts w:ascii="Bookman Old Style" w:eastAsia="Bookman Old Style" w:hAnsi="Bookman Old Style" w:cs="Bookman Old Style"/>
-                <w:sz w:val="24"/>
-                <w:szCs w:val="24"/>
-              </w:rPr>
-              <w:t>{perangkatDaerah}</w:t>
-            </w:r>
-            <w:r>
-              <w:rPr>
-                <w:rFonts w:ascii="Bookman Old Style" w:eastAsia="Bookman Old Style" w:hAnsi="Bookman Old Style" w:cs="Bookman Old Style"/>
-                <w:sz w:val="24"/>
-                <w:szCs w:val="24"/>
-              </w:rPr>
-              <w:t xml:space="preserve"> selanjutnya disebut sebagai </w:t>
+              </w:rPr>
+              <w:t>{</w:t>
+            </w:r>
+            <w:proofErr w:type="spellStart"/>
+            <w:r>
+              <w:rPr>
+                <w:rFonts w:ascii="Bookman Old Style" w:eastAsia="Bookman Old Style" w:hAnsi="Bookman Old Style" w:cs="Bookman Old Style"/>
+                <w:sz w:val="24"/>
+                <w:szCs w:val="24"/>
+              </w:rPr>
+              <w:t>jabatan</w:t>
+            </w:r>
+            <w:r>
+              <w:rPr>
+                <w:rFonts w:ascii="Bookman Old Style" w:eastAsia="Bookman Old Style" w:hAnsi="Bookman Old Style" w:cs="Bookman Old Style"/>
+                <w:sz w:val="24"/>
+                <w:szCs w:val="24"/>
+              </w:rPr>
+              <w:t>Peserta</w:t>
+            </w:r>
+            <w:proofErr w:type="spellEnd"/>
+            <w:r>
+              <w:rPr>
+                <w:rFonts w:ascii="Bookman Old Style" w:eastAsia="Bookman Old Style" w:hAnsi="Bookman Old Style" w:cs="Bookman Old Style"/>
+                <w:sz w:val="24"/>
+                <w:szCs w:val="24"/>
+              </w:rPr>
+              <w:t xml:space="preserve">} pada </w:t>
+            </w:r>
+            <w:r>
+              <w:rPr>
+                <w:rFonts w:ascii="Bookman Old Style" w:eastAsia="Bookman Old Style" w:hAnsi="Bookman Old Style" w:cs="Bookman Old Style"/>
+                <w:sz w:val="24"/>
+                <w:szCs w:val="24"/>
+              </w:rPr>
+              <w:t>{</w:t>
+            </w:r>
+            <w:proofErr w:type="spellStart"/>
+            <w:r>
+              <w:rPr>
+                <w:rFonts w:ascii="Bookman Old Style" w:eastAsia="Bookman Old Style" w:hAnsi="Bookman Old Style" w:cs="Bookman Old Style"/>
+                <w:sz w:val="24"/>
+                <w:szCs w:val="24"/>
+              </w:rPr>
+              <w:t>perangkatDaerah</w:t>
+            </w:r>
+            <w:proofErr w:type="spellEnd"/>
+            <w:r>
+              <w:rPr>
+                <w:rFonts w:ascii="Bookman Old Style" w:eastAsia="Bookman Old Style" w:hAnsi="Bookman Old Style" w:cs="Bookman Old Style"/>
+                <w:sz w:val="24"/>
+                <w:szCs w:val="24"/>
+              </w:rPr>
+              <w:t>}</w:t>
+            </w:r>
+            <w:r>
+              <w:rPr>
+                <w:rFonts w:ascii="Bookman Old Style" w:eastAsia="Bookman Old Style" w:hAnsi="Bookman Old Style" w:cs="Bookman Old Style"/>
+                <w:sz w:val="24"/>
+                <w:szCs w:val="24"/>
+              </w:rPr>
+              <w:t xml:space="preserve"> </w:t>
+            </w:r>
+            <w:proofErr w:type="spellStart"/>
+            <w:r>
+              <w:rPr>
+                <w:rFonts w:ascii="Bookman Old Style" w:eastAsia="Bookman Old Style" w:hAnsi="Bookman Old Style" w:cs="Bookman Old Style"/>
+                <w:sz w:val="24"/>
+                <w:szCs w:val="24"/>
+              </w:rPr>
+              <w:t>selanjutnya</w:t>
+            </w:r>
+            <w:proofErr w:type="spellEnd"/>
+            <w:r>
+              <w:rPr>
+                <w:rFonts w:ascii="Bookman Old Style" w:eastAsia="Bookman Old Style" w:hAnsi="Bookman Old Style" w:cs="Bookman Old Style"/>
+                <w:sz w:val="24"/>
+                <w:szCs w:val="24"/>
+              </w:rPr>
+              <w:t xml:space="preserve"> </w:t>
+            </w:r>
+            <w:proofErr w:type="spellStart"/>
+            <w:r>
+              <w:rPr>
+                <w:rFonts w:ascii="Bookman Old Style" w:eastAsia="Bookman Old Style" w:hAnsi="Bookman Old Style" w:cs="Bookman Old Style"/>
+                <w:sz w:val="24"/>
+                <w:szCs w:val="24"/>
+              </w:rPr>
+              <w:t>disebut</w:t>
+            </w:r>
+            <w:proofErr w:type="spellEnd"/>
+            <w:r>
+              <w:rPr>
+                <w:rFonts w:ascii="Bookman Old Style" w:eastAsia="Bookman Old Style" w:hAnsi="Bookman Old Style" w:cs="Bookman Old Style"/>
+                <w:sz w:val="24"/>
+                <w:szCs w:val="24"/>
+              </w:rPr>
+              <w:t xml:space="preserve"> </w:t>
+            </w:r>
+            <w:proofErr w:type="spellStart"/>
+            <w:r>
+              <w:rPr>
+                <w:rFonts w:ascii="Bookman Old Style" w:eastAsia="Bookman Old Style" w:hAnsi="Bookman Old Style" w:cs="Bookman Old Style"/>
+                <w:sz w:val="24"/>
+                <w:szCs w:val="24"/>
+              </w:rPr>
+              <w:t>sebagai</w:t>
+            </w:r>
+            <w:proofErr w:type="spellEnd"/>
+            <w:r>
+              <w:rPr>
+                <w:rFonts w:ascii="Bookman Old Style" w:eastAsia="Bookman Old Style" w:hAnsi="Bookman Old Style" w:cs="Bookman Old Style"/>
+                <w:sz w:val="24"/>
+                <w:szCs w:val="24"/>
+              </w:rPr>
+              <w:t xml:space="preserve"> </w:t>
             </w:r>
             <w:r>
               <w:rPr>
@@ -1095,7 +1748,7 @@
     </w:tbl>
     <w:p>
       <w:pPr>
-        <w:spacing w:before="240" w:after="240" w:line="360" w:lineRule="auto"/>
+        <w:spacing w:before="240" w:after="240" w:line="276" w:lineRule="auto"/>
         <w:ind w:firstLine="720"/>
         <w:jc w:val="both"/>
         <w:rPr>
@@ -1110,29 +1763,153 @@
           <w:sz w:val="24"/>
           <w:szCs w:val="24"/>
         </w:rPr>
-        <w:t xml:space="preserve">PIHAK KESATU dan PIHAK KEDUA telah melaksanakan desk penghapusan Barang Milik Daerah (BMD), dengan hasil sampai hari ini masih nihil atau belum terdapat penghapusan Barang Milik Daerah dari </w:t>
-      </w:r>
-      <w:r>
-        <w:rPr>
-          <w:rFonts w:ascii="Bookman Old Style" w:eastAsia="Bookman Old Style" w:hAnsi="Bookman Old Style" w:cs="Bookman Old Style"/>
-          <w:sz w:val="24"/>
-          <w:szCs w:val="24"/>
-          <w:highlight w:val="yellow"/>
-        </w:rPr>
-        <w:t>&lt;&lt;skpd&gt;&gt;</w:t>
-      </w:r>
-      <w:r>
-        <w:rPr>
-          <w:rFonts w:ascii="Bookman Old Style" w:eastAsia="Bookman Old Style" w:hAnsi="Bookman Old Style" w:cs="Bookman Old Style"/>
-          <w:sz w:val="24"/>
-          <w:szCs w:val="24"/>
-        </w:rPr>
-        <w:t>.</w:t>
-      </w:r>
+        <w:t xml:space="preserve">PIHAK KESATU dan PIHAK KEDUA </w:t>
+      </w:r>
+      <w:proofErr w:type="spellStart"/>
+      <w:r>
+        <w:rPr>
+          <w:rFonts w:ascii="Bookman Old Style" w:eastAsia="Bookman Old Style" w:hAnsi="Bookman Old Style" w:cs="Bookman Old Style"/>
+          <w:sz w:val="24"/>
+          <w:szCs w:val="24"/>
+        </w:rPr>
+        <w:t>telah</w:t>
+      </w:r>
+      <w:proofErr w:type="spellEnd"/>
+      <w:r>
+        <w:rPr>
+          <w:rFonts w:ascii="Bookman Old Style" w:eastAsia="Bookman Old Style" w:hAnsi="Bookman Old Style" w:cs="Bookman Old Style"/>
+          <w:sz w:val="24"/>
+          <w:szCs w:val="24"/>
+        </w:rPr>
+        <w:t xml:space="preserve"> </w:t>
+      </w:r>
+      <w:proofErr w:type="spellStart"/>
+      <w:r>
+        <w:rPr>
+          <w:rFonts w:ascii="Bookman Old Style" w:eastAsia="Bookman Old Style" w:hAnsi="Bookman Old Style" w:cs="Bookman Old Style"/>
+          <w:sz w:val="24"/>
+          <w:szCs w:val="24"/>
+        </w:rPr>
+        <w:t>melaksanakan</w:t>
+      </w:r>
+      <w:proofErr w:type="spellEnd"/>
+      <w:r>
+        <w:rPr>
+          <w:rFonts w:ascii="Bookman Old Style" w:eastAsia="Bookman Old Style" w:hAnsi="Bookman Old Style" w:cs="Bookman Old Style"/>
+          <w:sz w:val="24"/>
+          <w:szCs w:val="24"/>
+        </w:rPr>
+        <w:t xml:space="preserve"> desk</w:t>
+      </w:r>
+      <w:r>
+        <w:rPr>
+          <w:rFonts w:ascii="Bookman Old Style" w:eastAsia="Bookman Old Style" w:hAnsi="Bookman Old Style" w:cs="Bookman Old Style"/>
+          <w:sz w:val="24"/>
+          <w:szCs w:val="24"/>
+        </w:rPr>
+        <w:t xml:space="preserve"> </w:t>
+      </w:r>
+      <w:proofErr w:type="spellStart"/>
+      <w:r>
+        <w:rPr>
+          <w:rFonts w:ascii="Bookman Old Style" w:eastAsia="Bookman Old Style" w:hAnsi="Bookman Old Style" w:cs="Bookman Old Style"/>
+          <w:sz w:val="24"/>
+          <w:szCs w:val="24"/>
+        </w:rPr>
+        <w:t>usulan</w:t>
+      </w:r>
+      <w:proofErr w:type="spellEnd"/>
+      <w:r>
+        <w:rPr>
+          <w:rFonts w:ascii="Bookman Old Style" w:eastAsia="Bookman Old Style" w:hAnsi="Bookman Old Style" w:cs="Bookman Old Style"/>
+          <w:sz w:val="24"/>
+          <w:szCs w:val="24"/>
+        </w:rPr>
+        <w:t xml:space="preserve"> RKBDM 2027 </w:t>
+      </w:r>
+      <w:proofErr w:type="spellStart"/>
+      <w:r>
+        <w:rPr>
+          <w:rFonts w:ascii="Bookman Old Style" w:eastAsia="Bookman Old Style" w:hAnsi="Bookman Old Style" w:cs="Bookman Old Style"/>
+          <w:sz w:val="24"/>
+          <w:szCs w:val="24"/>
+        </w:rPr>
+        <w:t>dengan</w:t>
+      </w:r>
+      <w:proofErr w:type="spellEnd"/>
+      <w:r>
+        <w:rPr>
+          <w:rFonts w:ascii="Bookman Old Style" w:eastAsia="Bookman Old Style" w:hAnsi="Bookman Old Style" w:cs="Bookman Old Style"/>
+          <w:sz w:val="24"/>
+          <w:szCs w:val="24"/>
+        </w:rPr>
+        <w:t xml:space="preserve"> </w:t>
+      </w:r>
+      <w:proofErr w:type="spellStart"/>
+      <w:r>
+        <w:rPr>
+          <w:rFonts w:ascii="Bookman Old Style" w:eastAsia="Bookman Old Style" w:hAnsi="Bookman Old Style" w:cs="Bookman Old Style"/>
+          <w:sz w:val="24"/>
+          <w:szCs w:val="24"/>
+        </w:rPr>
+        <w:t>hasil</w:t>
+      </w:r>
+      <w:proofErr w:type="spellEnd"/>
+      <w:r>
+        <w:rPr>
+          <w:rFonts w:ascii="Bookman Old Style" w:eastAsia="Bookman Old Style" w:hAnsi="Bookman Old Style" w:cs="Bookman Old Style"/>
+          <w:sz w:val="24"/>
+          <w:szCs w:val="24"/>
+        </w:rPr>
+        <w:t xml:space="preserve"> </w:t>
+      </w:r>
+      <w:proofErr w:type="spellStart"/>
+      <w:r>
+        <w:rPr>
+          <w:rFonts w:ascii="Bookman Old Style" w:eastAsia="Bookman Old Style" w:hAnsi="Bookman Old Style" w:cs="Bookman Old Style"/>
+          <w:sz w:val="24"/>
+          <w:szCs w:val="24"/>
+        </w:rPr>
+        <w:t>sebagaimana</w:t>
+      </w:r>
+      <w:proofErr w:type="spellEnd"/>
+      <w:r>
+        <w:rPr>
+          <w:rFonts w:ascii="Bookman Old Style" w:eastAsia="Bookman Old Style" w:hAnsi="Bookman Old Style" w:cs="Bookman Old Style"/>
+          <w:sz w:val="24"/>
+          <w:szCs w:val="24"/>
+        </w:rPr>
+        <w:t xml:space="preserve"> </w:t>
+      </w:r>
+      <w:proofErr w:type="spellStart"/>
+      <w:proofErr w:type="gramStart"/>
+      <w:r>
+        <w:rPr>
+          <w:rFonts w:ascii="Bookman Old Style" w:eastAsia="Bookman Old Style" w:hAnsi="Bookman Old Style" w:cs="Bookman Old Style"/>
+          <w:sz w:val="24"/>
+          <w:szCs w:val="24"/>
+        </w:rPr>
+        <w:t>berikut</w:t>
+      </w:r>
+      <w:proofErr w:type="spellEnd"/>
+      <w:r>
+        <w:rPr>
+          <w:rFonts w:ascii="Bookman Old Style" w:eastAsia="Bookman Old Style" w:hAnsi="Bookman Old Style" w:cs="Bookman Old Style"/>
+          <w:sz w:val="24"/>
+          <w:szCs w:val="24"/>
+        </w:rPr>
+        <w:t xml:space="preserve"> :</w:t>
+      </w:r>
+      <w:proofErr w:type="gramEnd"/>
     </w:p>
     <w:p>
       <w:pPr>
-        <w:spacing w:before="240" w:after="240" w:line="360" w:lineRule="auto"/>
+        <w:pStyle w:val="ListParagraph"/>
+        <w:numPr>
+          <w:ilvl w:val="0"/>
+          <w:numId w:val="1"/>
+        </w:numPr>
+        <w:spacing w:before="240" w:after="240" w:line="276" w:lineRule="auto"/>
         <w:jc w:val="both"/>
         <w:rPr>
           <w:rFonts w:ascii="Bookman Old Style" w:eastAsia="Bookman Old Style" w:hAnsi="Bookman Old Style" w:cs="Bookman Old Style"/>
@@ -1146,7 +1923,762 @@
           <w:sz w:val="24"/>
           <w:szCs w:val="24"/>
         </w:rPr>
-        <w:t>Demikian Berita Acara Desk Penghapusan Barang Milik Daerah ini dibuat dengan sebenarnya untuk dipergunakan sebagaimana mestinya.</w:t>
+        <w:t xml:space="preserve">Surat </w:t>
+      </w:r>
+      <w:proofErr w:type="spellStart"/>
+      <w:r>
+        <w:rPr>
+          <w:rFonts w:ascii="Bookman Old Style" w:eastAsia="Bookman Old Style" w:hAnsi="Bookman Old Style" w:cs="Bookman Old Style"/>
+          <w:sz w:val="24"/>
+          <w:szCs w:val="24"/>
+        </w:rPr>
+        <w:t>pengatar</w:t>
+      </w:r>
+      <w:proofErr w:type="spellEnd"/>
+      <w:r>
+        <w:rPr>
+          <w:rFonts w:ascii="Bookman Old Style" w:eastAsia="Bookman Old Style" w:hAnsi="Bookman Old Style" w:cs="Bookman Old Style"/>
+          <w:sz w:val="24"/>
+          <w:szCs w:val="24"/>
+        </w:rPr>
+        <w:t xml:space="preserve"> </w:t>
+      </w:r>
+      <w:r>
+        <w:rPr>
+          <w:rFonts w:ascii="Bookman Old Style" w:eastAsia="Bookman Old Style" w:hAnsi="Bookman Old Style" w:cs="Bookman Old Style"/>
+          <w:sz w:val="24"/>
+          <w:szCs w:val="24"/>
+          <w:highlight w:val="yellow"/>
+        </w:rPr>
+        <w:t>{</w:t>
+      </w:r>
+      <w:proofErr w:type="spellStart"/>
+      <w:r>
+        <w:rPr>
+          <w:rFonts w:ascii="Bookman Old Style" w:eastAsia="Bookman Old Style" w:hAnsi="Bookman Old Style" w:cs="Bookman Old Style"/>
+          <w:sz w:val="24"/>
+          <w:szCs w:val="24"/>
+          <w:highlight w:val="yellow"/>
+        </w:rPr>
+        <w:t>hasilSuratPengantar</w:t>
+      </w:r>
+      <w:proofErr w:type="spellEnd"/>
+      <w:r>
+        <w:rPr>
+          <w:rFonts w:ascii="Bookman Old Style" w:eastAsia="Bookman Old Style" w:hAnsi="Bookman Old Style" w:cs="Bookman Old Style"/>
+          <w:sz w:val="24"/>
+          <w:szCs w:val="24"/>
+          <w:highlight w:val="yellow"/>
+        </w:rPr>
+        <w:t>}</w:t>
+      </w:r>
+      <w:r>
+        <w:rPr>
+          <w:rFonts w:ascii="Bookman Old Style" w:eastAsia="Bookman Old Style" w:hAnsi="Bookman Old Style" w:cs="Bookman Old Style"/>
+          <w:sz w:val="24"/>
+          <w:szCs w:val="24"/>
+        </w:rPr>
+        <w:t>.</w:t>
+      </w:r>
+    </w:p>
+    <w:p>
+      <w:pPr>
+        <w:pStyle w:val="ListParagraph"/>
+        <w:numPr>
+          <w:ilvl w:val="0"/>
+          <w:numId w:val="1"/>
+        </w:numPr>
+        <w:spacing w:before="240" w:after="240" w:line="276" w:lineRule="auto"/>
+        <w:jc w:val="both"/>
+        <w:rPr>
+          <w:rFonts w:ascii="Bookman Old Style" w:eastAsia="Bookman Old Style" w:hAnsi="Bookman Old Style" w:cs="Bookman Old Style"/>
+          <w:sz w:val="24"/>
+          <w:szCs w:val="24"/>
+        </w:rPr>
+      </w:pPr>
+      <w:proofErr w:type="spellStart"/>
+      <w:r>
+        <w:rPr>
+          <w:rFonts w:ascii="Bookman Old Style" w:eastAsia="Bookman Old Style" w:hAnsi="Bookman Old Style" w:cs="Bookman Old Style"/>
+          <w:sz w:val="24"/>
+          <w:szCs w:val="24"/>
+        </w:rPr>
+        <w:t>Usulan</w:t>
+      </w:r>
+      <w:proofErr w:type="spellEnd"/>
+      <w:r>
+        <w:rPr>
+          <w:rFonts w:ascii="Bookman Old Style" w:eastAsia="Bookman Old Style" w:hAnsi="Bookman Old Style" w:cs="Bookman Old Style"/>
+          <w:sz w:val="24"/>
+          <w:szCs w:val="24"/>
+        </w:rPr>
+        <w:t xml:space="preserve"> RKBMD </w:t>
+      </w:r>
+      <w:proofErr w:type="spellStart"/>
+      <w:r>
+        <w:rPr>
+          <w:rFonts w:ascii="Bookman Old Style" w:eastAsia="Bookman Old Style" w:hAnsi="Bookman Old Style" w:cs="Bookman Old Style"/>
+          <w:sz w:val="24"/>
+          <w:szCs w:val="24"/>
+        </w:rPr>
+        <w:t>Pengadaan</w:t>
+      </w:r>
+      <w:proofErr w:type="spellEnd"/>
+      <w:r>
+        <w:rPr>
+          <w:rFonts w:ascii="Bookman Old Style" w:eastAsia="Bookman Old Style" w:hAnsi="Bookman Old Style" w:cs="Bookman Old Style"/>
+          <w:sz w:val="24"/>
+          <w:szCs w:val="24"/>
+        </w:rPr>
+        <w:t xml:space="preserve"> </w:t>
+      </w:r>
+      <w:r>
+        <w:rPr>
+          <w:rFonts w:ascii="Bookman Old Style" w:eastAsia="Bookman Old Style" w:hAnsi="Bookman Old Style" w:cs="Bookman Old Style"/>
+          <w:sz w:val="24"/>
+          <w:szCs w:val="24"/>
+          <w:highlight w:val="yellow"/>
+        </w:rPr>
+        <w:t>{</w:t>
+      </w:r>
+      <w:proofErr w:type="spellStart"/>
+      <w:r>
+        <w:rPr>
+          <w:rFonts w:ascii="Bookman Old Style" w:eastAsia="Bookman Old Style" w:hAnsi="Bookman Old Style" w:cs="Bookman Old Style"/>
+          <w:sz w:val="24"/>
+          <w:szCs w:val="24"/>
+          <w:highlight w:val="yellow"/>
+        </w:rPr>
+        <w:t>hasilUsulanRKBMDPengadaan</w:t>
+      </w:r>
+      <w:proofErr w:type="spellEnd"/>
+      <w:r>
+        <w:rPr>
+          <w:rFonts w:ascii="Bookman Old Style" w:eastAsia="Bookman Old Style" w:hAnsi="Bookman Old Style" w:cs="Bookman Old Style"/>
+          <w:sz w:val="24"/>
+          <w:szCs w:val="24"/>
+          <w:highlight w:val="yellow"/>
+        </w:rPr>
+        <w:t>}</w:t>
+      </w:r>
+      <w:r>
+        <w:rPr>
+          <w:rFonts w:ascii="Bookman Old Style" w:eastAsia="Bookman Old Style" w:hAnsi="Bookman Old Style" w:cs="Bookman Old Style"/>
+          <w:sz w:val="24"/>
+          <w:szCs w:val="24"/>
+        </w:rPr>
+        <w:t>.</w:t>
+      </w:r>
+      <w:r>
+        <w:rPr>
+          <w:rFonts w:ascii="Bookman Old Style" w:eastAsia="Bookman Old Style" w:hAnsi="Bookman Old Style" w:cs="Bookman Old Style"/>
+          <w:sz w:val="24"/>
+          <w:szCs w:val="24"/>
+        </w:rPr>
+        <w:t xml:space="preserve"> </w:t>
+      </w:r>
+    </w:p>
+    <w:p>
+      <w:pPr>
+        <w:pStyle w:val="ListParagraph"/>
+        <w:numPr>
+          <w:ilvl w:val="0"/>
+          <w:numId w:val="1"/>
+        </w:numPr>
+        <w:spacing w:before="240" w:after="240" w:line="276" w:lineRule="auto"/>
+        <w:jc w:val="both"/>
+        <w:rPr>
+          <w:rFonts w:ascii="Bookman Old Style" w:eastAsia="Bookman Old Style" w:hAnsi="Bookman Old Style" w:cs="Bookman Old Style"/>
+          <w:sz w:val="24"/>
+          <w:szCs w:val="24"/>
+        </w:rPr>
+      </w:pPr>
+      <w:proofErr w:type="spellStart"/>
+      <w:r>
+        <w:rPr>
+          <w:rFonts w:ascii="Bookman Old Style" w:eastAsia="Bookman Old Style" w:hAnsi="Bookman Old Style" w:cs="Bookman Old Style"/>
+          <w:sz w:val="24"/>
+          <w:szCs w:val="24"/>
+        </w:rPr>
+        <w:t>Usulan</w:t>
+      </w:r>
+      <w:proofErr w:type="spellEnd"/>
+      <w:r>
+        <w:rPr>
+          <w:rFonts w:ascii="Bookman Old Style" w:eastAsia="Bookman Old Style" w:hAnsi="Bookman Old Style" w:cs="Bookman Old Style"/>
+          <w:sz w:val="24"/>
+          <w:szCs w:val="24"/>
+        </w:rPr>
+        <w:t xml:space="preserve"> RKBMD </w:t>
+      </w:r>
+      <w:proofErr w:type="spellStart"/>
+      <w:r>
+        <w:rPr>
+          <w:rFonts w:ascii="Bookman Old Style" w:eastAsia="Bookman Old Style" w:hAnsi="Bookman Old Style" w:cs="Bookman Old Style"/>
+          <w:sz w:val="24"/>
+          <w:szCs w:val="24"/>
+        </w:rPr>
+        <w:t>Pemeliharaan</w:t>
+      </w:r>
+      <w:proofErr w:type="spellEnd"/>
+      <w:r>
+        <w:rPr>
+          <w:rFonts w:ascii="Bookman Old Style" w:eastAsia="Bookman Old Style" w:hAnsi="Bookman Old Style" w:cs="Bookman Old Style"/>
+          <w:sz w:val="24"/>
+          <w:szCs w:val="24"/>
+        </w:rPr>
+        <w:t xml:space="preserve"> </w:t>
+      </w:r>
+      <w:r>
+        <w:rPr>
+          <w:rFonts w:ascii="Bookman Old Style" w:eastAsia="Bookman Old Style" w:hAnsi="Bookman Old Style" w:cs="Bookman Old Style"/>
+          <w:sz w:val="24"/>
+          <w:szCs w:val="24"/>
+          <w:highlight w:val="yellow"/>
+        </w:rPr>
+        <w:t>{</w:t>
+      </w:r>
+      <w:proofErr w:type="spellStart"/>
+      <w:r>
+        <w:rPr>
+          <w:rFonts w:ascii="Bookman Old Style" w:eastAsia="Bookman Old Style" w:hAnsi="Bookman Old Style" w:cs="Bookman Old Style"/>
+          <w:sz w:val="24"/>
+          <w:szCs w:val="24"/>
+          <w:highlight w:val="yellow"/>
+        </w:rPr>
+        <w:t>hasilUsulanRKBMDPemeliharaan</w:t>
+      </w:r>
+      <w:proofErr w:type="spellEnd"/>
+      <w:r>
+        <w:rPr>
+          <w:rFonts w:ascii="Bookman Old Style" w:eastAsia="Bookman Old Style" w:hAnsi="Bookman Old Style" w:cs="Bookman Old Style"/>
+          <w:sz w:val="24"/>
+          <w:szCs w:val="24"/>
+          <w:highlight w:val="yellow"/>
+        </w:rPr>
+        <w:t>}</w:t>
+      </w:r>
+      <w:r>
+        <w:rPr>
+          <w:rFonts w:ascii="Bookman Old Style" w:eastAsia="Bookman Old Style" w:hAnsi="Bookman Old Style" w:cs="Bookman Old Style"/>
+          <w:sz w:val="24"/>
+          <w:szCs w:val="24"/>
+        </w:rPr>
+        <w:t>.</w:t>
+      </w:r>
+    </w:p>
+    <w:p>
+      <w:pPr>
+        <w:pStyle w:val="ListParagraph"/>
+        <w:numPr>
+          <w:ilvl w:val="0"/>
+          <w:numId w:val="1"/>
+        </w:numPr>
+        <w:spacing w:before="240" w:after="240" w:line="276" w:lineRule="auto"/>
+        <w:jc w:val="both"/>
+        <w:rPr>
+          <w:rFonts w:ascii="Bookman Old Style" w:eastAsia="Bookman Old Style" w:hAnsi="Bookman Old Style" w:cs="Bookman Old Style"/>
+          <w:sz w:val="24"/>
+          <w:szCs w:val="24"/>
+        </w:rPr>
+      </w:pPr>
+      <w:r>
+        <w:rPr>
+          <w:rFonts w:ascii="Bookman Old Style" w:eastAsia="Bookman Old Style" w:hAnsi="Bookman Old Style" w:cs="Bookman Old Style"/>
+          <w:sz w:val="24"/>
+          <w:szCs w:val="24"/>
+        </w:rPr>
+        <w:t>{#</w:t>
+      </w:r>
+      <w:proofErr w:type="gramStart"/>
+      <w:r>
+        <w:rPr>
+          <w:rFonts w:ascii="Bookman Old Style" w:eastAsia="Bookman Old Style" w:hAnsi="Bookman Old Style" w:cs="Bookman Old Style"/>
+          <w:sz w:val="24"/>
+          <w:szCs w:val="24"/>
+        </w:rPr>
+        <w:t>tanggalPerbaikan}Perbaikan</w:t>
+      </w:r>
+      <w:proofErr w:type="gramEnd"/>
+      <w:r>
+        <w:rPr>
+          <w:rFonts w:ascii="Bookman Old Style" w:eastAsia="Bookman Old Style" w:hAnsi="Bookman Old Style" w:cs="Bookman Old Style"/>
+          <w:sz w:val="24"/>
+          <w:szCs w:val="24"/>
+        </w:rPr>
+        <w:t xml:space="preserve"> </w:t>
+      </w:r>
+      <w:proofErr w:type="spellStart"/>
+      <w:r>
+        <w:rPr>
+          <w:rFonts w:ascii="Bookman Old Style" w:eastAsia="Bookman Old Style" w:hAnsi="Bookman Old Style" w:cs="Bookman Old Style"/>
+          <w:sz w:val="24"/>
+          <w:szCs w:val="24"/>
+        </w:rPr>
+        <w:t>sebagaimana</w:t>
+      </w:r>
+      <w:proofErr w:type="spellEnd"/>
+      <w:r>
+        <w:rPr>
+          <w:rFonts w:ascii="Bookman Old Style" w:eastAsia="Bookman Old Style" w:hAnsi="Bookman Old Style" w:cs="Bookman Old Style"/>
+          <w:sz w:val="24"/>
+          <w:szCs w:val="24"/>
+        </w:rPr>
+        <w:t xml:space="preserve"> </w:t>
+      </w:r>
+      <w:proofErr w:type="spellStart"/>
+      <w:r>
+        <w:rPr>
+          <w:rFonts w:ascii="Bookman Old Style" w:eastAsia="Bookman Old Style" w:hAnsi="Bookman Old Style" w:cs="Bookman Old Style"/>
+          <w:sz w:val="24"/>
+          <w:szCs w:val="24"/>
+        </w:rPr>
+        <w:t>hasil</w:t>
+      </w:r>
+      <w:proofErr w:type="spellEnd"/>
+      <w:r>
+        <w:rPr>
+          <w:rFonts w:ascii="Bookman Old Style" w:eastAsia="Bookman Old Style" w:hAnsi="Bookman Old Style" w:cs="Bookman Old Style"/>
+          <w:sz w:val="24"/>
+          <w:szCs w:val="24"/>
+        </w:rPr>
+        <w:t xml:space="preserve"> desk </w:t>
+      </w:r>
+      <w:proofErr w:type="spellStart"/>
+      <w:r>
+        <w:rPr>
+          <w:rFonts w:ascii="Bookman Old Style" w:eastAsia="Bookman Old Style" w:hAnsi="Bookman Old Style" w:cs="Bookman Old Style"/>
+          <w:sz w:val="24"/>
+          <w:szCs w:val="24"/>
+        </w:rPr>
+        <w:t>akan</w:t>
+      </w:r>
+      <w:proofErr w:type="spellEnd"/>
+      <w:r>
+        <w:rPr>
+          <w:rFonts w:ascii="Bookman Old Style" w:eastAsia="Bookman Old Style" w:hAnsi="Bookman Old Style" w:cs="Bookman Old Style"/>
+          <w:sz w:val="24"/>
+          <w:szCs w:val="24"/>
+        </w:rPr>
+        <w:t xml:space="preserve"> </w:t>
+      </w:r>
+      <w:proofErr w:type="spellStart"/>
+      <w:r>
+        <w:rPr>
+          <w:rFonts w:ascii="Bookman Old Style" w:eastAsia="Bookman Old Style" w:hAnsi="Bookman Old Style" w:cs="Bookman Old Style"/>
+          <w:sz w:val="24"/>
+          <w:szCs w:val="24"/>
+        </w:rPr>
+        <w:t>ditindaklanjuti</w:t>
+      </w:r>
+      <w:proofErr w:type="spellEnd"/>
+      <w:r>
+        <w:rPr>
+          <w:rFonts w:ascii="Bookman Old Style" w:eastAsia="Bookman Old Style" w:hAnsi="Bookman Old Style" w:cs="Bookman Old Style"/>
+          <w:sz w:val="24"/>
+          <w:szCs w:val="24"/>
+        </w:rPr>
+        <w:t xml:space="preserve"> oleh </w:t>
+      </w:r>
+      <w:proofErr w:type="spellStart"/>
+      <w:r>
+        <w:rPr>
+          <w:rFonts w:ascii="Bookman Old Style" w:eastAsia="Bookman Old Style" w:hAnsi="Bookman Old Style" w:cs="Bookman Old Style"/>
+          <w:sz w:val="24"/>
+          <w:szCs w:val="24"/>
+        </w:rPr>
+        <w:t>Perangkat</w:t>
+      </w:r>
+      <w:proofErr w:type="spellEnd"/>
+      <w:r>
+        <w:rPr>
+          <w:rFonts w:ascii="Bookman Old Style" w:eastAsia="Bookman Old Style" w:hAnsi="Bookman Old Style" w:cs="Bookman Old Style"/>
+          <w:sz w:val="24"/>
+          <w:szCs w:val="24"/>
+        </w:rPr>
+        <w:t xml:space="preserve"> Daerah dan </w:t>
+      </w:r>
+      <w:proofErr w:type="spellStart"/>
+      <w:r>
+        <w:rPr>
+          <w:rFonts w:ascii="Bookman Old Style" w:eastAsia="Bookman Old Style" w:hAnsi="Bookman Old Style" w:cs="Bookman Old Style"/>
+          <w:sz w:val="24"/>
+          <w:szCs w:val="24"/>
+        </w:rPr>
+        <w:t>disampaikan</w:t>
+      </w:r>
+      <w:proofErr w:type="spellEnd"/>
+      <w:r>
+        <w:rPr>
+          <w:rFonts w:ascii="Bookman Old Style" w:eastAsia="Bookman Old Style" w:hAnsi="Bookman Old Style" w:cs="Bookman Old Style"/>
+          <w:sz w:val="24"/>
+          <w:szCs w:val="24"/>
+        </w:rPr>
+        <w:t xml:space="preserve"> </w:t>
+      </w:r>
+      <w:proofErr w:type="spellStart"/>
+      <w:r>
+        <w:rPr>
+          <w:rFonts w:ascii="Bookman Old Style" w:eastAsia="Bookman Old Style" w:hAnsi="Bookman Old Style" w:cs="Bookman Old Style"/>
+          <w:sz w:val="24"/>
+          <w:szCs w:val="24"/>
+        </w:rPr>
+        <w:t>kembali</w:t>
+      </w:r>
+      <w:proofErr w:type="spellEnd"/>
+      <w:r>
+        <w:rPr>
+          <w:rFonts w:ascii="Bookman Old Style" w:eastAsia="Bookman Old Style" w:hAnsi="Bookman Old Style" w:cs="Bookman Old Style"/>
+          <w:sz w:val="24"/>
+          <w:szCs w:val="24"/>
+        </w:rPr>
+        <w:t xml:space="preserve"> </w:t>
+      </w:r>
+      <w:proofErr w:type="spellStart"/>
+      <w:r>
+        <w:rPr>
+          <w:rFonts w:ascii="Bookman Old Style" w:eastAsia="Bookman Old Style" w:hAnsi="Bookman Old Style" w:cs="Bookman Old Style"/>
+          <w:sz w:val="24"/>
+          <w:szCs w:val="24"/>
+        </w:rPr>
+        <w:t>kepada</w:t>
+      </w:r>
+      <w:proofErr w:type="spellEnd"/>
+      <w:r>
+        <w:rPr>
+          <w:rFonts w:ascii="Bookman Old Style" w:eastAsia="Bookman Old Style" w:hAnsi="Bookman Old Style" w:cs="Bookman Old Style"/>
+          <w:sz w:val="24"/>
+          <w:szCs w:val="24"/>
+        </w:rPr>
+        <w:t xml:space="preserve"> Badan </w:t>
+      </w:r>
+      <w:proofErr w:type="spellStart"/>
+      <w:r>
+        <w:rPr>
+          <w:rFonts w:ascii="Bookman Old Style" w:eastAsia="Bookman Old Style" w:hAnsi="Bookman Old Style" w:cs="Bookman Old Style"/>
+          <w:sz w:val="24"/>
+          <w:szCs w:val="24"/>
+        </w:rPr>
+        <w:t>Keuangan</w:t>
+      </w:r>
+      <w:proofErr w:type="spellEnd"/>
+      <w:r>
+        <w:rPr>
+          <w:rFonts w:ascii="Bookman Old Style" w:eastAsia="Bookman Old Style" w:hAnsi="Bookman Old Style" w:cs="Bookman Old Style"/>
+          <w:sz w:val="24"/>
+          <w:szCs w:val="24"/>
+        </w:rPr>
+        <w:t xml:space="preserve"> dan Aset Daerah paling </w:t>
+      </w:r>
+      <w:proofErr w:type="spellStart"/>
+      <w:r>
+        <w:rPr>
+          <w:rFonts w:ascii="Bookman Old Style" w:eastAsia="Bookman Old Style" w:hAnsi="Bookman Old Style" w:cs="Bookman Old Style"/>
+          <w:sz w:val="24"/>
+          <w:szCs w:val="24"/>
+        </w:rPr>
+        <w:t>lambat</w:t>
+      </w:r>
+      <w:proofErr w:type="spellEnd"/>
+      <w:r>
+        <w:rPr>
+          <w:rFonts w:ascii="Bookman Old Style" w:eastAsia="Bookman Old Style" w:hAnsi="Bookman Old Style" w:cs="Bookman Old Style"/>
+          <w:sz w:val="24"/>
+          <w:szCs w:val="24"/>
+        </w:rPr>
+        <w:t xml:space="preserve"> </w:t>
+      </w:r>
+      <w:proofErr w:type="spellStart"/>
+      <w:r>
+        <w:rPr>
+          <w:rFonts w:ascii="Bookman Old Style" w:eastAsia="Bookman Old Style" w:hAnsi="Bookman Old Style" w:cs="Bookman Old Style"/>
+          <w:sz w:val="24"/>
+          <w:szCs w:val="24"/>
+          <w:highlight w:val="yellow"/>
+        </w:rPr>
+        <w:t>tanggal</w:t>
+      </w:r>
+      <w:proofErr w:type="spellEnd"/>
+      <w:r>
+        <w:rPr>
+          <w:rFonts w:ascii="Bookman Old Style" w:eastAsia="Bookman Old Style" w:hAnsi="Bookman Old Style" w:cs="Bookman Old Style"/>
+          <w:sz w:val="24"/>
+          <w:szCs w:val="24"/>
+          <w:highlight w:val="yellow"/>
+        </w:rPr>
+        <w:t xml:space="preserve"> {</w:t>
+      </w:r>
+      <w:proofErr w:type="spellStart"/>
+      <w:r>
+        <w:rPr>
+          <w:rFonts w:ascii="Bookman Old Style" w:eastAsia="Bookman Old Style" w:hAnsi="Bookman Old Style" w:cs="Bookman Old Style"/>
+          <w:sz w:val="24"/>
+          <w:szCs w:val="24"/>
+          <w:highlight w:val="yellow"/>
+        </w:rPr>
+        <w:t>tanggalPerbaikan</w:t>
+      </w:r>
+      <w:proofErr w:type="spellEnd"/>
+      <w:proofErr w:type="gramStart"/>
+      <w:r>
+        <w:rPr>
+          <w:rFonts w:ascii="Bookman Old Style" w:eastAsia="Bookman Old Style" w:hAnsi="Bookman Old Style" w:cs="Bookman Old Style"/>
+          <w:sz w:val="24"/>
+          <w:szCs w:val="24"/>
+          <w:highlight w:val="yellow"/>
+        </w:rPr>
+        <w:t>}</w:t>
+      </w:r>
+      <w:r>
+        <w:rPr>
+          <w:rFonts w:ascii="Bookman Old Style" w:eastAsia="Bookman Old Style" w:hAnsi="Bookman Old Style" w:cs="Bookman Old Style"/>
+          <w:sz w:val="24"/>
+          <w:szCs w:val="24"/>
+        </w:rPr>
+        <w:t>.{</w:t>
+      </w:r>
+      <w:proofErr w:type="gramEnd"/>
+      <w:r>
+        <w:rPr>
+          <w:rFonts w:ascii="Bookman Old Style" w:eastAsia="Bookman Old Style" w:hAnsi="Bookman Old Style" w:cs="Bookman Old Style"/>
+          <w:sz w:val="24"/>
+          <w:szCs w:val="24"/>
+        </w:rPr>
+        <w:t>/</w:t>
+      </w:r>
+      <w:proofErr w:type="spellStart"/>
+      <w:r>
+        <w:rPr>
+          <w:rFonts w:ascii="Bookman Old Style" w:eastAsia="Bookman Old Style" w:hAnsi="Bookman Old Style" w:cs="Bookman Old Style"/>
+          <w:sz w:val="24"/>
+          <w:szCs w:val="24"/>
+        </w:rPr>
+        <w:t>tanggalPerbaikan</w:t>
+      </w:r>
+      <w:proofErr w:type="spellEnd"/>
+      <w:r>
+        <w:rPr>
+          <w:rFonts w:ascii="Bookman Old Style" w:eastAsia="Bookman Old Style" w:hAnsi="Bookman Old Style" w:cs="Bookman Old Style"/>
+          <w:sz w:val="24"/>
+          <w:szCs w:val="24"/>
+        </w:rPr>
+        <w:t>}</w:t>
+      </w:r>
+      <w:r>
+        <w:rPr>
+          <w:rFonts w:ascii="Bookman Old Style" w:eastAsia="Bookman Old Style" w:hAnsi="Bookman Old Style" w:cs="Bookman Old Style"/>
+          <w:sz w:val="24"/>
+          <w:szCs w:val="24"/>
+        </w:rPr>
+        <w:t>.</w:t>
+      </w:r>
+    </w:p>
+    <w:p>
+      <w:pPr>
+        <w:spacing w:before="240" w:after="240" w:line="276" w:lineRule="auto"/>
+        <w:ind w:firstLine="720"/>
+        <w:jc w:val="both"/>
+        <w:rPr>
+          <w:rFonts w:ascii="Bookman Old Style" w:eastAsia="Bookman Old Style" w:hAnsi="Bookman Old Style" w:cs="Bookman Old Style"/>
+          <w:sz w:val="24"/>
+          <w:szCs w:val="24"/>
+        </w:rPr>
+      </w:pPr>
+      <w:proofErr w:type="spellStart"/>
+      <w:r>
+        <w:rPr>
+          <w:rFonts w:ascii="Bookman Old Style" w:eastAsia="Bookman Old Style" w:hAnsi="Bookman Old Style" w:cs="Bookman Old Style"/>
+          <w:sz w:val="24"/>
+          <w:szCs w:val="24"/>
+        </w:rPr>
+        <w:t>Demikian</w:t>
+      </w:r>
+      <w:proofErr w:type="spellEnd"/>
+      <w:r>
+        <w:rPr>
+          <w:rFonts w:ascii="Bookman Old Style" w:eastAsia="Bookman Old Style" w:hAnsi="Bookman Old Style" w:cs="Bookman Old Style"/>
+          <w:sz w:val="24"/>
+          <w:szCs w:val="24"/>
+        </w:rPr>
+        <w:t xml:space="preserve"> Berita Acara </w:t>
+      </w:r>
+      <w:r>
+        <w:rPr>
+          <w:rFonts w:ascii="Bookman Old Style" w:eastAsia="Bookman Old Style" w:hAnsi="Bookman Old Style" w:cs="Bookman Old Style"/>
+          <w:sz w:val="24"/>
+          <w:szCs w:val="24"/>
+        </w:rPr>
+        <w:t xml:space="preserve">Desk </w:t>
+      </w:r>
+      <w:proofErr w:type="spellStart"/>
+      <w:r>
+        <w:rPr>
+          <w:rFonts w:ascii="Bookman Old Style" w:eastAsia="Bookman Old Style" w:hAnsi="Bookman Old Style" w:cs="Bookman Old Style"/>
+          <w:sz w:val="24"/>
+          <w:szCs w:val="24"/>
+        </w:rPr>
+        <w:t>Usulan</w:t>
+      </w:r>
+      <w:proofErr w:type="spellEnd"/>
+      <w:r>
+        <w:rPr>
+          <w:rFonts w:ascii="Bookman Old Style" w:eastAsia="Bookman Old Style" w:hAnsi="Bookman Old Style" w:cs="Bookman Old Style"/>
+          <w:sz w:val="24"/>
+          <w:szCs w:val="24"/>
+        </w:rPr>
+        <w:t xml:space="preserve"> RKBMD 2027</w:t>
+      </w:r>
+      <w:r>
+        <w:rPr>
+          <w:rFonts w:ascii="Bookman Old Style" w:eastAsia="Bookman Old Style" w:hAnsi="Bookman Old Style" w:cs="Bookman Old Style"/>
+          <w:sz w:val="24"/>
+          <w:szCs w:val="24"/>
+        </w:rPr>
+        <w:t xml:space="preserve"> </w:t>
+      </w:r>
+      <w:proofErr w:type="spellStart"/>
+      <w:r>
+        <w:rPr>
+          <w:rFonts w:ascii="Bookman Old Style" w:eastAsia="Bookman Old Style" w:hAnsi="Bookman Old Style" w:cs="Bookman Old Style"/>
+          <w:sz w:val="24"/>
+          <w:szCs w:val="24"/>
+        </w:rPr>
+        <w:t>ini</w:t>
+      </w:r>
+      <w:proofErr w:type="spellEnd"/>
+      <w:r>
+        <w:rPr>
+          <w:rFonts w:ascii="Bookman Old Style" w:eastAsia="Bookman Old Style" w:hAnsi="Bookman Old Style" w:cs="Bookman Old Style"/>
+          <w:sz w:val="24"/>
+          <w:szCs w:val="24"/>
+        </w:rPr>
+        <w:t xml:space="preserve"> </w:t>
+      </w:r>
+      <w:proofErr w:type="spellStart"/>
+      <w:r>
+        <w:rPr>
+          <w:rFonts w:ascii="Bookman Old Style" w:eastAsia="Bookman Old Style" w:hAnsi="Bookman Old Style" w:cs="Bookman Old Style"/>
+          <w:sz w:val="24"/>
+          <w:szCs w:val="24"/>
+        </w:rPr>
+        <w:t>dibuat</w:t>
+      </w:r>
+      <w:proofErr w:type="spellEnd"/>
+      <w:r>
+        <w:rPr>
+          <w:rFonts w:ascii="Bookman Old Style" w:eastAsia="Bookman Old Style" w:hAnsi="Bookman Old Style" w:cs="Bookman Old Style"/>
+          <w:sz w:val="24"/>
+          <w:szCs w:val="24"/>
+        </w:rPr>
+        <w:t xml:space="preserve"> </w:t>
+      </w:r>
+      <w:proofErr w:type="spellStart"/>
+      <w:r>
+        <w:rPr>
+          <w:rFonts w:ascii="Bookman Old Style" w:eastAsia="Bookman Old Style" w:hAnsi="Bookman Old Style" w:cs="Bookman Old Style"/>
+          <w:sz w:val="24"/>
+          <w:szCs w:val="24"/>
+        </w:rPr>
+        <w:t>dengan</w:t>
+      </w:r>
+      <w:proofErr w:type="spellEnd"/>
+      <w:r>
+        <w:rPr>
+          <w:rFonts w:ascii="Bookman Old Style" w:eastAsia="Bookman Old Style" w:hAnsi="Bookman Old Style" w:cs="Bookman Old Style"/>
+          <w:sz w:val="24"/>
+          <w:szCs w:val="24"/>
+        </w:rPr>
+        <w:t xml:space="preserve"> </w:t>
+      </w:r>
+      <w:proofErr w:type="spellStart"/>
+      <w:r>
+        <w:rPr>
+          <w:rFonts w:ascii="Bookman Old Style" w:eastAsia="Bookman Old Style" w:hAnsi="Bookman Old Style" w:cs="Bookman Old Style"/>
+          <w:sz w:val="24"/>
+          <w:szCs w:val="24"/>
+        </w:rPr>
+        <w:t>sebenarnya</w:t>
+      </w:r>
+      <w:proofErr w:type="spellEnd"/>
+      <w:r>
+        <w:rPr>
+          <w:rFonts w:ascii="Bookman Old Style" w:eastAsia="Bookman Old Style" w:hAnsi="Bookman Old Style" w:cs="Bookman Old Style"/>
+          <w:sz w:val="24"/>
+          <w:szCs w:val="24"/>
+        </w:rPr>
+        <w:t xml:space="preserve"> </w:t>
+      </w:r>
+      <w:proofErr w:type="spellStart"/>
+      <w:r>
+        <w:rPr>
+          <w:rFonts w:ascii="Bookman Old Style" w:eastAsia="Bookman Old Style" w:hAnsi="Bookman Old Style" w:cs="Bookman Old Style"/>
+          <w:sz w:val="24"/>
+          <w:szCs w:val="24"/>
+        </w:rPr>
+        <w:t>untuk</w:t>
+      </w:r>
+      <w:proofErr w:type="spellEnd"/>
+      <w:r>
+        <w:rPr>
+          <w:rFonts w:ascii="Bookman Old Style" w:eastAsia="Bookman Old Style" w:hAnsi="Bookman Old Style" w:cs="Bookman Old Style"/>
+          <w:sz w:val="24"/>
+          <w:szCs w:val="24"/>
+        </w:rPr>
+        <w:t xml:space="preserve"> </w:t>
+      </w:r>
+      <w:proofErr w:type="spellStart"/>
+      <w:r>
+        <w:rPr>
+          <w:rFonts w:ascii="Bookman Old Style" w:eastAsia="Bookman Old Style" w:hAnsi="Bookman Old Style" w:cs="Bookman Old Style"/>
+          <w:sz w:val="24"/>
+          <w:szCs w:val="24"/>
+        </w:rPr>
+        <w:t>dipergunakan</w:t>
+      </w:r>
+      <w:proofErr w:type="spellEnd"/>
+      <w:r>
+        <w:rPr>
+          <w:rFonts w:ascii="Bookman Old Style" w:eastAsia="Bookman Old Style" w:hAnsi="Bookman Old Style" w:cs="Bookman Old Style"/>
+          <w:sz w:val="24"/>
+          <w:szCs w:val="24"/>
+        </w:rPr>
+        <w:t xml:space="preserve"> </w:t>
+      </w:r>
+      <w:proofErr w:type="spellStart"/>
+      <w:r>
+        <w:rPr>
+          <w:rFonts w:ascii="Bookman Old Style" w:eastAsia="Bookman Old Style" w:hAnsi="Bookman Old Style" w:cs="Bookman Old Style"/>
+          <w:sz w:val="24"/>
+          <w:szCs w:val="24"/>
+        </w:rPr>
+        <w:t>sebagaimana</w:t>
+      </w:r>
+      <w:proofErr w:type="spellEnd"/>
+      <w:r>
+        <w:rPr>
+          <w:rFonts w:ascii="Bookman Old Style" w:eastAsia="Bookman Old Style" w:hAnsi="Bookman Old Style" w:cs="Bookman Old Style"/>
+          <w:sz w:val="24"/>
+          <w:szCs w:val="24"/>
+        </w:rPr>
+        <w:t xml:space="preserve"> </w:t>
+      </w:r>
+      <w:proofErr w:type="spellStart"/>
+      <w:r>
+        <w:rPr>
+          <w:rFonts w:ascii="Bookman Old Style" w:eastAsia="Bookman Old Style" w:hAnsi="Bookman Old Style" w:cs="Bookman Old Style"/>
+          <w:sz w:val="24"/>
+          <w:szCs w:val="24"/>
+        </w:rPr>
+        <w:t>mestinya</w:t>
+      </w:r>
+      <w:proofErr w:type="spellEnd"/>
+      <w:r>
+        <w:rPr>
+          <w:rFonts w:ascii="Bookman Old Style" w:eastAsia="Bookman Old Style" w:hAnsi="Bookman Old Style" w:cs="Bookman Old Style"/>
+          <w:sz w:val="24"/>
+          <w:szCs w:val="24"/>
+        </w:rPr>
+        <w:t>.</w:t>
       </w:r>
     </w:p>
     <w:tbl>
@@ -1175,7 +2707,7 @@
               <w:tabs>
                 <w:tab w:val="left" w:pos="0"/>
               </w:tabs>
-              <w:spacing w:line="360" w:lineRule="auto"/>
+              <w:spacing w:line="276" w:lineRule="auto"/>
               <w:jc w:val="center"/>
               <w:rPr>
                 <w:rFonts w:ascii="Bookman Old Style" w:eastAsia="Bookman Old Style" w:hAnsi="Bookman Old Style" w:cs="Bookman Old Style"/>
@@ -1206,7 +2738,7 @@
                 <w:tab w:val="center" w:pos="2160"/>
                 <w:tab w:val="center" w:pos="7380"/>
               </w:tabs>
-              <w:spacing w:line="360" w:lineRule="auto"/>
+              <w:spacing w:line="276" w:lineRule="auto"/>
               <w:rPr>
                 <w:rFonts w:ascii="Bookman Old Style" w:eastAsia="Bookman Old Style" w:hAnsi="Bookman Old Style" w:cs="Bookman Old Style"/>
                 <w:sz w:val="24"/>
@@ -1224,7 +2756,7 @@
               <w:tabs>
                 <w:tab w:val="left" w:pos="0"/>
               </w:tabs>
-              <w:spacing w:line="360" w:lineRule="auto"/>
+              <w:spacing w:line="276" w:lineRule="auto"/>
               <w:jc w:val="center"/>
               <w:rPr>
                 <w:rFonts w:ascii="Bookman Old Style" w:eastAsia="Bookman Old Style" w:hAnsi="Bookman Old Style" w:cs="Bookman Old Style"/>
@@ -1271,7 +2803,7 @@
                 <w:tab w:val="center" w:pos="2160"/>
                 <w:tab w:val="center" w:pos="7380"/>
               </w:tabs>
-              <w:spacing w:line="360" w:lineRule="auto"/>
+              <w:spacing w:line="276" w:lineRule="auto"/>
               <w:rPr>
                 <w:rFonts w:ascii="Bookman Old Style" w:eastAsia="Bookman Old Style" w:hAnsi="Bookman Old Style" w:cs="Bookman Old Style"/>
                 <w:sz w:val="24"/>
@@ -1290,7 +2822,7 @@
                 <w:tab w:val="center" w:pos="2160"/>
                 <w:tab w:val="center" w:pos="7380"/>
               </w:tabs>
-              <w:spacing w:line="360" w:lineRule="auto"/>
+              <w:spacing w:line="276" w:lineRule="auto"/>
               <w:rPr>
                 <w:rFonts w:ascii="Bookman Old Style" w:eastAsia="Bookman Old Style" w:hAnsi="Bookman Old Style" w:cs="Bookman Old Style"/>
                 <w:sz w:val="24"/>
@@ -1309,7 +2841,7 @@
                 <w:tab w:val="center" w:pos="2160"/>
                 <w:tab w:val="center" w:pos="7380"/>
               </w:tabs>
-              <w:spacing w:line="360" w:lineRule="auto"/>
+              <w:spacing w:line="276" w:lineRule="auto"/>
               <w:rPr>
                 <w:rFonts w:ascii="Bookman Old Style" w:eastAsia="Bookman Old Style" w:hAnsi="Bookman Old Style" w:cs="Bookman Old Style"/>
                 <w:sz w:val="24"/>
@@ -1329,7 +2861,7 @@
           </w:tcPr>
           <w:p>
             <w:pPr>
-              <w:spacing w:line="360" w:lineRule="auto"/>
+              <w:spacing w:line="276" w:lineRule="auto"/>
               <w:jc w:val="center"/>
               <w:rPr>
                 <w:rFonts w:ascii="Bookman Old Style" w:eastAsia="Bookman Old Style" w:hAnsi="Bookman Old Style" w:cs="Bookman Old Style"/>
@@ -1347,7 +2879,29 @@
                 <w:highlight w:val="yellow"/>
                 <w:u w:val="single"/>
               </w:rPr>
-              <w:t xml:space="preserve">&lt;&lt;nama&gt;&gt; </w:t>
+              <w:t>{</w:t>
+            </w:r>
+            <w:proofErr w:type="spellStart"/>
+            <w:r>
+              <w:rPr>
+                <w:rFonts w:ascii="Bookman Old Style" w:eastAsia="Bookman Old Style" w:hAnsi="Bookman Old Style" w:cs="Bookman Old Style"/>
+                <w:sz w:val="24"/>
+                <w:szCs w:val="24"/>
+                <w:highlight w:val="yellow"/>
+                <w:u w:val="single"/>
+              </w:rPr>
+              <w:t>namaPeserta</w:t>
+            </w:r>
+            <w:proofErr w:type="spellEnd"/>
+            <w:r>
+              <w:rPr>
+                <w:rFonts w:ascii="Bookman Old Style" w:eastAsia="Bookman Old Style" w:hAnsi="Bookman Old Style" w:cs="Bookman Old Style"/>
+                <w:sz w:val="24"/>
+                <w:szCs w:val="24"/>
+                <w:highlight w:val="yellow"/>
+                <w:u w:val="single"/>
+              </w:rPr>
+              <w:t xml:space="preserve">} </w:t>
             </w:r>
             <w:r>
               <w:rPr>
@@ -1374,7 +2928,27 @@
                 <w:szCs w:val="24"/>
                 <w:highlight w:val="yellow"/>
               </w:rPr>
-              <w:t>&lt;&lt;nip&gt;&gt;</w:t>
+              <w:t>{</w:t>
+            </w:r>
+            <w:proofErr w:type="spellStart"/>
+            <w:r>
+              <w:rPr>
+                <w:rFonts w:ascii="Bookman Old Style" w:eastAsia="Bookman Old Style" w:hAnsi="Bookman Old Style" w:cs="Bookman Old Style"/>
+                <w:sz w:val="24"/>
+                <w:szCs w:val="24"/>
+                <w:highlight w:val="yellow"/>
+              </w:rPr>
+              <w:t>nipPeserta</w:t>
+            </w:r>
+            <w:proofErr w:type="spellEnd"/>
+            <w:r>
+              <w:rPr>
+                <w:rFonts w:ascii="Bookman Old Style" w:eastAsia="Bookman Old Style" w:hAnsi="Bookman Old Style" w:cs="Bookman Old Style"/>
+                <w:sz w:val="24"/>
+                <w:szCs w:val="24"/>
+                <w:highlight w:val="yellow"/>
+              </w:rPr>
+              <w:t>}</w:t>
             </w:r>
           </w:p>
         </w:tc>
@@ -1388,7 +2962,7 @@
                 <w:tab w:val="center" w:pos="2160"/>
                 <w:tab w:val="center" w:pos="7380"/>
               </w:tabs>
-              <w:spacing w:line="360" w:lineRule="auto"/>
+              <w:spacing w:line="276" w:lineRule="auto"/>
               <w:rPr>
                 <w:rFonts w:ascii="Bookman Old Style" w:eastAsia="Bookman Old Style" w:hAnsi="Bookman Old Style" w:cs="Bookman Old Style"/>
                 <w:sz w:val="24"/>
@@ -1405,7 +2979,7 @@
           </w:tcPr>
           <w:p>
             <w:pPr>
-              <w:spacing w:line="360" w:lineRule="auto"/>
+              <w:spacing w:line="276" w:lineRule="auto"/>
               <w:jc w:val="center"/>
               <w:rPr>
                 <w:rFonts w:ascii="Bookman Old Style" w:eastAsia="Bookman Old Style" w:hAnsi="Bookman Old Style" w:cs="Bookman Old Style"/>
@@ -1422,7 +2996,29 @@
                 <w:highlight w:val="yellow"/>
                 <w:u w:val="single"/>
               </w:rPr>
-              <w:t>Fernanda Akhsanuddin Almas</w:t>
+              <w:t>{</w:t>
+            </w:r>
+            <w:proofErr w:type="spellStart"/>
+            <w:r>
+              <w:rPr>
+                <w:rFonts w:ascii="Bookman Old Style" w:eastAsia="Bookman Old Style" w:hAnsi="Bookman Old Style" w:cs="Bookman Old Style"/>
+                <w:sz w:val="24"/>
+                <w:szCs w:val="24"/>
+                <w:highlight w:val="yellow"/>
+                <w:u w:val="single"/>
+              </w:rPr>
+              <w:t>namaPerekon</w:t>
+            </w:r>
+            <w:proofErr w:type="spellEnd"/>
+            <w:r>
+              <w:rPr>
+                <w:rFonts w:ascii="Bookman Old Style" w:eastAsia="Bookman Old Style" w:hAnsi="Bookman Old Style" w:cs="Bookman Old Style"/>
+                <w:sz w:val="24"/>
+                <w:szCs w:val="24"/>
+                <w:highlight w:val="yellow"/>
+                <w:u w:val="single"/>
+              </w:rPr>
+              <w:t>}</w:t>
             </w:r>
             <w:r>
               <w:rPr>
@@ -1449,7 +3045,27 @@
                 <w:szCs w:val="24"/>
                 <w:highlight w:val="yellow"/>
               </w:rPr>
-              <w:t>199910102022011002</w:t>
+              <w:t>{</w:t>
+            </w:r>
+            <w:proofErr w:type="spellStart"/>
+            <w:r>
+              <w:rPr>
+                <w:rFonts w:ascii="Bookman Old Style" w:eastAsia="Bookman Old Style" w:hAnsi="Bookman Old Style" w:cs="Bookman Old Style"/>
+                <w:sz w:val="24"/>
+                <w:szCs w:val="24"/>
+                <w:highlight w:val="yellow"/>
+              </w:rPr>
+              <w:t>nipPerekon</w:t>
+            </w:r>
+            <w:proofErr w:type="spellEnd"/>
+            <w:r>
+              <w:rPr>
+                <w:rFonts w:ascii="Bookman Old Style" w:eastAsia="Bookman Old Style" w:hAnsi="Bookman Old Style" w:cs="Bookman Old Style"/>
+                <w:sz w:val="24"/>
+                <w:szCs w:val="24"/>
+                <w:highlight w:val="yellow"/>
+              </w:rPr>
+              <w:t>}</w:t>
             </w:r>
           </w:p>
         </w:tc>
@@ -1487,6 +3103,103 @@
     </w:sectPr>
   </w:body>
 </w:document>
+</file>
+
+<file path=word/numbering.xml><?xml version="1.0" encoding="utf-8"?>
+<w:numbering xmlns:wpc="http://schemas.microsoft.com/office/word/2010/wordprocessingCanvas" xmlns:cx="http://schemas.microsoft.com/office/drawing/2014/chartex" xmlns:cx1="http://schemas.microsoft.com/office/drawing/2015/9/8/chartex" xmlns:cx2="http://schemas.microsoft.com/office/drawing/2015/10/21/chartex" xmlns:cx3="http://schemas.microsoft.com/office/drawing/2016/5/9/chartex" xmlns:cx4="http://schemas.microsoft.com/office/drawing/2016/5/10/chartex" xmlns:cx5="http://schemas.microsoft.com/office/drawing/2016/5/11/chartex" xmlns:cx6="http://schemas.microsoft.com/office/drawing/2016/5/12/chartex" xmlns:cx7="http://schemas.microsoft.com/office/drawing/2016/5/13/chartex" xmlns:cx8="http://schemas.microsoft.com/office/drawing/2016/5/14/chartex" xmlns:mc="http://schemas.openxmlformats.org/markup-compatibility/2006" xmlns:aink="http://schemas.microsoft.com/office/drawing/2016/ink" xmlns:am3d="http://schemas.microsoft.com/office/drawing/2017/model3d" xmlns:o="urn:schemas-microsoft-com:office:office" xmlns:oel="http://schemas.microsoft.com/office/2019/extlst" xmlns:r="http://schemas.openxmlformats.org/officeDocument/2006/relationships" xmlns:m="http://schemas.openxmlformats.org/officeDocument/2006/math" xmlns:v="urn:schemas-microsoft-com:vml" xmlns:wp14="http://schemas.microsoft.com/office/word/2010/wordprocessingDrawing" xmlns:wp="http://schemas.openxmlformats.org/drawingml/2006/wordprocessingDrawing" xmlns:w10="urn:schemas-microsoft-com:office:word" xmlns:w="http://schemas.openxmlformats.org/wordprocessingml/2006/main" xmlns:w14="http://schemas.microsoft.com/office/word/2010/wordml" xmlns:w15="http://schemas.microsoft.com/office/word/2012/wordml" xmlns:w16cex="http://schemas.microsoft.com/office/word/2018/wordml/cex" xmlns:w16cid="http://schemas.microsoft.com/office/word/2016/wordml/cid" xmlns:w16="http://schemas.microsoft.com/office/word/2018/wordml" xmlns:w16du="http://schemas.microsoft.com/office/word/2023/wordml/word16du" xmlns:w16sdtdh="http://schemas.microsoft.com/office/word/2020/wordml/sdtdatahash" xmlns:w16sdtfl="http://schemas.microsoft.com/office/word/2024/wordml/sdtformatlock" xmlns:w16se="http://schemas.microsoft.com/office/word/2015/wordml/symex" xmlns:wpg="http://schemas.microsoft.com/office/word/2010/wordprocessingGroup" xmlns:wpi="http://schemas.microsoft.com/office/word/2010/wordprocessingInk" xmlns:wne="http://schemas.microsoft.com/office/word/2006/wordml" xmlns:wps="http://schemas.microsoft.com/office/word/2010/wordprocessingShape" mc:Ignorable="w14 w15 w16se w16cid w16 w16cex w16sdtdh w16sdtfl w16du wp14">
+  <w:abstractNum w:abstractNumId="0" w15:restartNumberingAfterBreak="0">
+    <w:nsid w:val="0BC3630B"/>
+    <w:multiLevelType w:val="hybridMultilevel"/>
+    <w:tmpl w:val="76F88FD4"/>
+    <w:lvl w:ilvl="0" w:tplc="A6B04278">
+      <w:start w:val="1"/>
+      <w:numFmt w:val="decimal"/>
+      <w:lvlText w:val="%1."/>
+      <w:lvlJc w:val="left"/>
+      <w:pPr>
+        <w:ind w:left="1080" w:hanging="360"/>
+      </w:pPr>
+      <w:rPr>
+        <w:rFonts w:hint="default"/>
+      </w:rPr>
+    </w:lvl>
+    <w:lvl w:ilvl="1" w:tplc="38090019" w:tentative="1">
+      <w:start w:val="1"/>
+      <w:numFmt w:val="lowerLetter"/>
+      <w:lvlText w:val="%2."/>
+      <w:lvlJc w:val="left"/>
+      <w:pPr>
+        <w:ind w:left="1800" w:hanging="360"/>
+      </w:pPr>
+    </w:lvl>
+    <w:lvl w:ilvl="2" w:tplc="3809001B" w:tentative="1">
+      <w:start w:val="1"/>
+      <w:numFmt w:val="lowerRoman"/>
+      <w:lvlText w:val="%3."/>
+      <w:lvlJc w:val="right"/>
+      <w:pPr>
+        <w:ind w:left="2520" w:hanging="180"/>
+      </w:pPr>
+    </w:lvl>
+    <w:lvl w:ilvl="3" w:tplc="3809000F" w:tentative="1">
+      <w:start w:val="1"/>
+      <w:numFmt w:val="decimal"/>
+      <w:lvlText w:val="%4."/>
+      <w:lvlJc w:val="left"/>
+      <w:pPr>
+        <w:ind w:left="3240" w:hanging="360"/>
+      </w:pPr>
+    </w:lvl>
+    <w:lvl w:ilvl="4" w:tplc="38090019" w:tentative="1">
+      <w:start w:val="1"/>
+      <w:numFmt w:val="lowerLetter"/>
+      <w:lvlText w:val="%5."/>
+      <w:lvlJc w:val="left"/>
+      <w:pPr>
+        <w:ind w:left="3960" w:hanging="360"/>
+      </w:pPr>
+    </w:lvl>
+    <w:lvl w:ilvl="5" w:tplc="3809001B" w:tentative="1">
+      <w:start w:val="1"/>
+      <w:numFmt w:val="lowerRoman"/>
+      <w:lvlText w:val="%6."/>
+      <w:lvlJc w:val="right"/>
+      <w:pPr>
+        <w:ind w:left="4680" w:hanging="180"/>
+      </w:pPr>
+    </w:lvl>
+    <w:lvl w:ilvl="6" w:tplc="3809000F" w:tentative="1">
+      <w:start w:val="1"/>
+      <w:numFmt w:val="decimal"/>
+      <w:lvlText w:val="%7."/>
+      <w:lvlJc w:val="left"/>
+      <w:pPr>
+        <w:ind w:left="5400" w:hanging="360"/>
+      </w:pPr>
+    </w:lvl>
+    <w:lvl w:ilvl="7" w:tplc="38090019" w:tentative="1">
+      <w:start w:val="1"/>
+      <w:numFmt w:val="lowerLetter"/>
+      <w:lvlText w:val="%8."/>
+      <w:lvlJc w:val="left"/>
+      <w:pPr>
+        <w:ind w:left="6120" w:hanging="360"/>
+      </w:pPr>
+    </w:lvl>
+    <w:lvl w:ilvl="8" w:tplc="3809001B" w:tentative="1">
+      <w:start w:val="1"/>
+      <w:numFmt w:val="lowerRoman"/>
+      <w:lvlText w:val="%9."/>
+      <w:lvlJc w:val="right"/>
+      <w:pPr>
+        <w:ind w:left="6840" w:hanging="180"/>
+      </w:pPr>
+    </w:lvl>
+  </w:abstractNum>
+  <w:num w:numId="1" w16cid:durableId="927420690">
+    <w:abstractNumId w:val="0"/>
+  </w:num>
+</w:numbering>
 </file>
 
 <file path=word/styles.xml><?xml version="1.0" encoding="utf-8"?>
@@ -2105,6 +3818,17 @@
       </w:tblCellMar>
     </w:tblPr>
   </w:style>
+  <w:style w:type="paragraph" w:styleId="ListParagraph">
+    <w:name w:val="List Paragraph"/>
+    <w:basedOn w:val="Normal"/>
+    <w:uiPriority w:val="34"/>
+    <w:qFormat/>
+    <w:rsid w:val="00C263C6"/>
+    <w:pPr>
+      <w:ind w:left="720"/>
+      <w:contextualSpacing/>
+    </w:pPr>
+  </w:style>
 </w:styles>
 </file>
 

</xml_diff>

<commit_message>
feat: add docx template and generation logic for RKBMD desk minutes
</commit_message>
<xml_diff>
--- a/public/rkbmd/template-ba-desk.docx
+++ b/public/rkbmd/template-ba-desk.docx
@@ -374,7 +374,23 @@
           <w:szCs w:val="24"/>
         </w:rPr>
         <w:br/>
-        <w:t>NOMOR 900/</w:t>
+        <w:t xml:space="preserve">NOMOR </w:t>
+      </w:r>
+      <w:r>
+        <w:rPr>
+          <w:rFonts w:ascii="Bookman Old Style" w:eastAsia="Bookman Old Style" w:hAnsi="Bookman Old Style" w:cs="Bookman Old Style"/>
+          <w:sz w:val="24"/>
+          <w:szCs w:val="24"/>
+        </w:rPr>
+        <w:t>00.3.2</w:t>
+      </w:r>
+      <w:r>
+        <w:rPr>
+          <w:rFonts w:ascii="Bookman Old Style" w:eastAsia="Bookman Old Style" w:hAnsi="Bookman Old Style" w:cs="Bookman Old Style"/>
+          <w:sz w:val="24"/>
+          <w:szCs w:val="24"/>
+        </w:rPr>
+        <w:t>/</w:t>
       </w:r>
       <w:r>
         <w:rPr>
@@ -383,7 +399,25 @@
           <w:szCs w:val="24"/>
           <w:highlight w:val="yellow"/>
         </w:rPr>
+        <w:t xml:space="preserve">  </w:t>
+      </w:r>
+      <w:r>
+        <w:rPr>
+          <w:rFonts w:ascii="Bookman Old Style" w:eastAsia="Bookman Old Style" w:hAnsi="Bookman Old Style" w:cs="Bookman Old Style"/>
+          <w:sz w:val="24"/>
+          <w:szCs w:val="24"/>
+          <w:highlight w:val="yellow"/>
+        </w:rPr>
         <w:t xml:space="preserve">          </w:t>
+      </w:r>
+      <w:r>
+        <w:rPr>
+          <w:rFonts w:ascii="Bookman Old Style" w:eastAsia="Bookman Old Style" w:hAnsi="Bookman Old Style" w:cs="Bookman Old Style"/>
+          <w:sz w:val="24"/>
+          <w:szCs w:val="24"/>
+          <w:highlight w:val="yellow"/>
+        </w:rPr>
+        <w:t xml:space="preserve">       </w:t>
       </w:r>
       <w:r>
         <w:rPr>

</xml_diff>

<commit_message>
feat: implement export functionality for RKBMD procurement data to Excel format
</commit_message>
<xml_diff>
--- a/public/rkbmd/template-ba-desk.docx
+++ b/public/rkbmd/template-ba-desk.docx
@@ -345,10 +345,11 @@
           <w:szCs w:val="24"/>
         </w:rPr>
         <w:sectPr>
-          <w:pgSz w:w="11906" w:h="16838"/>
+          <w:pgSz w:w="12240" w:h="18720" w:code="14"/>
           <w:pgMar w:top="561" w:right="1137" w:bottom="1411" w:left="1699" w:header="720" w:footer="720" w:gutter="0"/>
           <w:pgNumType w:start="1"/>
           <w:cols w:space="720"/>
+          <w:docGrid w:linePitch="272"/>
         </w:sectPr>
       </w:pPr>
       <w:r>
@@ -3131,9 +3132,10 @@
     </w:p>
     <w:sectPr>
       <w:type w:val="continuous"/>
-      <w:pgSz w:w="11906" w:h="16838"/>
+      <w:pgSz w:w="12240" w:h="18720" w:code="14"/>
       <w:pgMar w:top="1411" w:right="1137" w:bottom="1411" w:left="1699" w:header="720" w:footer="720" w:gutter="0"/>
       <w:cols w:space="720"/>
+      <w:docGrid w:linePitch="272"/>
     </w:sectPr>
   </w:body>
 </w:document>

</xml_diff>